<commit_message>
METODOLOGIA: calendario del semestre con fechas generales y evaluación (evaluación individual 20% en septiembre; 4 versiones de 20% c/u: 10% sustentación individual con commits + 10% entrega en equipo), con espacio para la fecha exacta de cada grupo
</commit_message>
<xml_diff>
--- a/ProyectosDeAula/docs/0_METODOLOGIA.docx
+++ b/ProyectosDeAula/docs/0_METODOLOGIA.docx
@@ -20,7 +20,7 @@
       <w:pPr>
         <w:pStyle w:val="NormalWeb"/>
         <w:shd w:val="clear" w:color="auto" w:fill="F2F6FC"/>
-        <w:divId w:val="1743023829"/>
+        <w:divId w:val="1934430489"/>
         <w:rPr>
           <w:rFonts w:ascii="Calibri" w:hAnsi="Calibri" w:cs="Calibri"/>
           <w:sz w:val="22"/>
@@ -154,7 +154,7 @@
           <w:sz w:val="22"/>
           <w:szCs w:val="22"/>
         </w:rPr>
-        <w:pict w14:anchorId="12B5B680">
+        <w:pict w14:anchorId="30BE6475">
           <v:rect id="_x0000_i1025" style="width:0;height:1.5pt" o:hralign="center" o:hrstd="t" o:hr="t" fillcolor="#a0a0a0" stroked="f"/>
         </w:pict>
       </w:r>
@@ -1599,80 +1599,1155 @@
     </w:tbl>
     <w:p>
       <w:pPr>
-        <w:pStyle w:val="NormalWeb"/>
-        <w:rPr>
-          <w:rFonts w:ascii="Calibri" w:hAnsi="Calibri" w:cs="Calibri"/>
-          <w:sz w:val="22"/>
-          <w:szCs w:val="22"/>
-        </w:rPr>
-      </w:pPr>
-      <w:r>
-        <w:rPr>
-          <w:rFonts w:ascii="Calibri" w:hAnsi="Calibri" w:cs="Calibri"/>
-          <w:sz w:val="22"/>
-          <w:szCs w:val="22"/>
-        </w:rPr>
-        <w:t>Las fechas y porcentajes de cada versión los asigna el profesor en clase.</w:t>
+        <w:pStyle w:val="Ttulo3"/>
+        <w:rPr>
+          <w:rFonts w:ascii="Calibri" w:eastAsia="Times New Roman" w:hAnsi="Calibri" w:cs="Calibri"/>
+        </w:rPr>
+      </w:pPr>
+      <w:r>
+        <w:rPr>
+          <w:rFonts w:ascii="Calibri" w:eastAsia="Times New Roman" w:hAnsi="Calibri" w:cs="Calibri"/>
+        </w:rPr>
+        <w:t>2.1 Calendario y evaluación del semestre (100%)</w:t>
       </w:r>
     </w:p>
     <w:p>
       <w:pPr>
-        <w:pStyle w:val="Ttulo2"/>
-        <w:rPr>
-          <w:rFonts w:ascii="Calibri" w:eastAsia="Times New Roman" w:hAnsi="Calibri" w:cs="Calibri"/>
-        </w:rPr>
-      </w:pPr>
-      <w:r>
-        <w:rPr>
-          <w:rFonts w:ascii="Calibri" w:eastAsia="Times New Roman" w:hAnsi="Calibri" w:cs="Calibri"/>
-        </w:rPr>
-        <w:t>3. El spec kit que cada equipo ESCRIBE (por versión)</w:t>
+        <w:pStyle w:val="NormalWeb"/>
+        <w:rPr>
+          <w:rFonts w:ascii="Calibri" w:hAnsi="Calibri" w:cs="Calibri"/>
+          <w:sz w:val="22"/>
+          <w:szCs w:val="22"/>
+        </w:rPr>
+      </w:pPr>
+      <w:r>
+        <w:rPr>
+          <w:rFonts w:ascii="Calibri" w:hAnsi="Calibri" w:cs="Calibri"/>
+          <w:sz w:val="22"/>
+          <w:szCs w:val="22"/>
+        </w:rPr>
+        <w:t xml:space="preserve">Las fechas generales aplican a todos los grupos; la </w:t>
+      </w:r>
+      <w:r>
+        <w:rPr>
+          <w:rStyle w:val="Fuerte"/>
+          <w:rFonts w:ascii="Calibri" w:hAnsi="Calibri" w:cs="Calibri"/>
+          <w:sz w:val="22"/>
+          <w:szCs w:val="22"/>
+        </w:rPr>
+        <w:t>fecha exacta</w:t>
+      </w:r>
+      <w:r>
+        <w:rPr>
+          <w:rFonts w:ascii="Calibri" w:hAnsi="Calibri" w:cs="Calibri"/>
+          <w:sz w:val="22"/>
+          <w:szCs w:val="22"/>
+        </w:rPr>
+        <w:t xml:space="preserve"> de su grupo la fija el profesor en clase (anótela en el espacio en blanco).</w:t>
+      </w:r>
+    </w:p>
+    <w:tbl>
+      <w:tblPr>
+        <w:tblW w:w="5000" w:type="pct"/>
+        <w:tblCellMar>
+          <w:top w:w="15" w:type="dxa"/>
+          <w:left w:w="15" w:type="dxa"/>
+          <w:bottom w:w="15" w:type="dxa"/>
+          <w:right w:w="15" w:type="dxa"/>
+        </w:tblCellMar>
+        <w:tblLook w:val="04A0" w:firstRow="1" w:lastRow="0" w:firstColumn="1" w:lastColumn="0" w:noHBand="0" w:noVBand="1"/>
+      </w:tblPr>
+      <w:tblGrid>
+        <w:gridCol w:w="1857"/>
+        <w:gridCol w:w="1733"/>
+        <w:gridCol w:w="2058"/>
+        <w:gridCol w:w="3174"/>
+      </w:tblGrid>
+      <w:tr>
+        <w:trPr>
+          <w:tblHeader/>
+        </w:trPr>
+        <w:tc>
+          <w:tcPr>
+            <w:tcW w:w="0" w:type="auto"/>
+            <w:tcBorders>
+              <w:top w:val="single" w:sz="6" w:space="0" w:color="8EAADB"/>
+              <w:left w:val="single" w:sz="6" w:space="0" w:color="8EAADB"/>
+              <w:bottom w:val="single" w:sz="6" w:space="0" w:color="8EAADB"/>
+              <w:right w:val="single" w:sz="6" w:space="0" w:color="8EAADB"/>
+            </w:tcBorders>
+            <w:shd w:val="clear" w:color="auto" w:fill="D9E2F3"/>
+            <w:tcMar>
+              <w:top w:w="80" w:type="dxa"/>
+              <w:left w:w="120" w:type="dxa"/>
+              <w:bottom w:w="80" w:type="dxa"/>
+              <w:right w:w="120" w:type="dxa"/>
+            </w:tcMar>
+            <w:hideMark/>
+          </w:tcPr>
+          <w:p>
+            <w:pPr>
+              <w:spacing w:before="160" w:after="160"/>
+              <w:rPr>
+                <w:rFonts w:ascii="Calibri" w:eastAsia="Times New Roman" w:hAnsi="Calibri" w:cs="Calibri"/>
+                <w:b/>
+                <w:bCs/>
+                <w:sz w:val="20"/>
+                <w:szCs w:val="20"/>
+              </w:rPr>
+            </w:pPr>
+            <w:r>
+              <w:rPr>
+                <w:rFonts w:ascii="Calibri" w:eastAsia="Times New Roman" w:hAnsi="Calibri" w:cs="Calibri"/>
+                <w:b/>
+                <w:bCs/>
+                <w:sz w:val="20"/>
+                <w:szCs w:val="20"/>
+              </w:rPr>
+              <w:t>Momento</w:t>
+            </w:r>
+          </w:p>
+        </w:tc>
+        <w:tc>
+          <w:tcPr>
+            <w:tcW w:w="0" w:type="auto"/>
+            <w:tcBorders>
+              <w:top w:val="single" w:sz="6" w:space="0" w:color="8EAADB"/>
+              <w:left w:val="single" w:sz="6" w:space="0" w:color="8EAADB"/>
+              <w:bottom w:val="single" w:sz="6" w:space="0" w:color="8EAADB"/>
+              <w:right w:val="single" w:sz="6" w:space="0" w:color="8EAADB"/>
+            </w:tcBorders>
+            <w:shd w:val="clear" w:color="auto" w:fill="D9E2F3"/>
+            <w:tcMar>
+              <w:top w:w="80" w:type="dxa"/>
+              <w:left w:w="120" w:type="dxa"/>
+              <w:bottom w:w="80" w:type="dxa"/>
+              <w:right w:w="120" w:type="dxa"/>
+            </w:tcMar>
+            <w:hideMark/>
+          </w:tcPr>
+          <w:p>
+            <w:pPr>
+              <w:spacing w:before="160" w:after="160"/>
+              <w:rPr>
+                <w:rFonts w:ascii="Calibri" w:eastAsia="Times New Roman" w:hAnsi="Calibri" w:cs="Calibri"/>
+                <w:b/>
+                <w:bCs/>
+                <w:sz w:val="20"/>
+                <w:szCs w:val="20"/>
+              </w:rPr>
+            </w:pPr>
+            <w:r>
+              <w:rPr>
+                <w:rFonts w:ascii="Calibri" w:eastAsia="Times New Roman" w:hAnsi="Calibri" w:cs="Calibri"/>
+                <w:b/>
+                <w:bCs/>
+                <w:sz w:val="20"/>
+                <w:szCs w:val="20"/>
+              </w:rPr>
+              <w:t>Fecha general</w:t>
+            </w:r>
+          </w:p>
+        </w:tc>
+        <w:tc>
+          <w:tcPr>
+            <w:tcW w:w="0" w:type="auto"/>
+            <w:tcBorders>
+              <w:top w:val="single" w:sz="6" w:space="0" w:color="8EAADB"/>
+              <w:left w:val="single" w:sz="6" w:space="0" w:color="8EAADB"/>
+              <w:bottom w:val="single" w:sz="6" w:space="0" w:color="8EAADB"/>
+              <w:right w:val="single" w:sz="6" w:space="0" w:color="8EAADB"/>
+            </w:tcBorders>
+            <w:shd w:val="clear" w:color="auto" w:fill="D9E2F3"/>
+            <w:tcMar>
+              <w:top w:w="80" w:type="dxa"/>
+              <w:left w:w="120" w:type="dxa"/>
+              <w:bottom w:w="80" w:type="dxa"/>
+              <w:right w:w="120" w:type="dxa"/>
+            </w:tcMar>
+            <w:hideMark/>
+          </w:tcPr>
+          <w:p>
+            <w:pPr>
+              <w:spacing w:before="160" w:after="160"/>
+              <w:rPr>
+                <w:rFonts w:ascii="Calibri" w:eastAsia="Times New Roman" w:hAnsi="Calibri" w:cs="Calibri"/>
+                <w:b/>
+                <w:bCs/>
+                <w:sz w:val="20"/>
+                <w:szCs w:val="20"/>
+              </w:rPr>
+            </w:pPr>
+            <w:r>
+              <w:rPr>
+                <w:rFonts w:ascii="Calibri" w:eastAsia="Times New Roman" w:hAnsi="Calibri" w:cs="Calibri"/>
+                <w:b/>
+                <w:bCs/>
+                <w:sz w:val="20"/>
+                <w:szCs w:val="20"/>
+              </w:rPr>
+              <w:t>Fecha exacta (su grupo)</w:t>
+            </w:r>
+          </w:p>
+        </w:tc>
+        <w:tc>
+          <w:tcPr>
+            <w:tcW w:w="0" w:type="auto"/>
+            <w:tcBorders>
+              <w:top w:val="single" w:sz="6" w:space="0" w:color="8EAADB"/>
+              <w:left w:val="single" w:sz="6" w:space="0" w:color="8EAADB"/>
+              <w:bottom w:val="single" w:sz="6" w:space="0" w:color="8EAADB"/>
+              <w:right w:val="single" w:sz="6" w:space="0" w:color="8EAADB"/>
+            </w:tcBorders>
+            <w:shd w:val="clear" w:color="auto" w:fill="D9E2F3"/>
+            <w:tcMar>
+              <w:top w:w="80" w:type="dxa"/>
+              <w:left w:w="120" w:type="dxa"/>
+              <w:bottom w:w="80" w:type="dxa"/>
+              <w:right w:w="120" w:type="dxa"/>
+            </w:tcMar>
+            <w:hideMark/>
+          </w:tcPr>
+          <w:p>
+            <w:pPr>
+              <w:spacing w:before="160" w:after="160"/>
+              <w:rPr>
+                <w:rFonts w:ascii="Calibri" w:eastAsia="Times New Roman" w:hAnsi="Calibri" w:cs="Calibri"/>
+                <w:b/>
+                <w:bCs/>
+                <w:sz w:val="20"/>
+                <w:szCs w:val="20"/>
+              </w:rPr>
+            </w:pPr>
+            <w:r>
+              <w:rPr>
+                <w:rFonts w:ascii="Calibri" w:eastAsia="Times New Roman" w:hAnsi="Calibri" w:cs="Calibri"/>
+                <w:b/>
+                <w:bCs/>
+                <w:sz w:val="20"/>
+                <w:szCs w:val="20"/>
+              </w:rPr>
+              <w:t>Evaluación</w:t>
+            </w:r>
+          </w:p>
+        </w:tc>
+      </w:tr>
+      <w:tr>
+        <w:tc>
+          <w:tcPr>
+            <w:tcW w:w="0" w:type="auto"/>
+            <w:tcBorders>
+              <w:top w:val="single" w:sz="6" w:space="0" w:color="8EAADB"/>
+              <w:left w:val="single" w:sz="6" w:space="0" w:color="8EAADB"/>
+              <w:bottom w:val="single" w:sz="6" w:space="0" w:color="8EAADB"/>
+              <w:right w:val="single" w:sz="6" w:space="0" w:color="8EAADB"/>
+            </w:tcBorders>
+            <w:tcMar>
+              <w:top w:w="80" w:type="dxa"/>
+              <w:left w:w="120" w:type="dxa"/>
+              <w:bottom w:w="80" w:type="dxa"/>
+              <w:right w:w="120" w:type="dxa"/>
+            </w:tcMar>
+            <w:hideMark/>
+          </w:tcPr>
+          <w:p>
+            <w:pPr>
+              <w:spacing w:before="160" w:after="160"/>
+              <w:rPr>
+                <w:rFonts w:ascii="Calibri" w:eastAsia="Times New Roman" w:hAnsi="Calibri" w:cs="Calibri"/>
+                <w:sz w:val="20"/>
+                <w:szCs w:val="20"/>
+              </w:rPr>
+            </w:pPr>
+            <w:r>
+              <w:rPr>
+                <w:rStyle w:val="Fuerte"/>
+                <w:rFonts w:ascii="Calibri" w:eastAsia="Times New Roman" w:hAnsi="Calibri" w:cs="Calibri"/>
+                <w:sz w:val="20"/>
+                <w:szCs w:val="20"/>
+              </w:rPr>
+              <w:t>Evaluación individual teórico-práctica</w:t>
+            </w:r>
+          </w:p>
+        </w:tc>
+        <w:tc>
+          <w:tcPr>
+            <w:tcW w:w="0" w:type="auto"/>
+            <w:tcBorders>
+              <w:top w:val="single" w:sz="6" w:space="0" w:color="8EAADB"/>
+              <w:left w:val="single" w:sz="6" w:space="0" w:color="8EAADB"/>
+              <w:bottom w:val="single" w:sz="6" w:space="0" w:color="8EAADB"/>
+              <w:right w:val="single" w:sz="6" w:space="0" w:color="8EAADB"/>
+            </w:tcBorders>
+            <w:tcMar>
+              <w:top w:w="80" w:type="dxa"/>
+              <w:left w:w="120" w:type="dxa"/>
+              <w:bottom w:w="80" w:type="dxa"/>
+              <w:right w:w="120" w:type="dxa"/>
+            </w:tcMar>
+            <w:hideMark/>
+          </w:tcPr>
+          <w:p>
+            <w:pPr>
+              <w:spacing w:before="160" w:after="160"/>
+              <w:rPr>
+                <w:rFonts w:ascii="Calibri" w:eastAsia="Times New Roman" w:hAnsi="Calibri" w:cs="Calibri"/>
+                <w:sz w:val="20"/>
+                <w:szCs w:val="20"/>
+              </w:rPr>
+            </w:pPr>
+            <w:r>
+              <w:rPr>
+                <w:rFonts w:ascii="Calibri" w:eastAsia="Times New Roman" w:hAnsi="Calibri" w:cs="Calibri"/>
+                <w:sz w:val="20"/>
+                <w:szCs w:val="20"/>
+              </w:rPr>
+              <w:t xml:space="preserve">Segunda semana de </w:t>
+            </w:r>
+            <w:r>
+              <w:rPr>
+                <w:rStyle w:val="Fuerte"/>
+                <w:rFonts w:ascii="Calibri" w:eastAsia="Times New Roman" w:hAnsi="Calibri" w:cs="Calibri"/>
+                <w:sz w:val="20"/>
+                <w:szCs w:val="20"/>
+              </w:rPr>
+              <w:t>septiembre</w:t>
+            </w:r>
+          </w:p>
+        </w:tc>
+        <w:tc>
+          <w:tcPr>
+            <w:tcW w:w="0" w:type="auto"/>
+            <w:tcBorders>
+              <w:top w:val="single" w:sz="6" w:space="0" w:color="8EAADB"/>
+              <w:left w:val="single" w:sz="6" w:space="0" w:color="8EAADB"/>
+              <w:bottom w:val="single" w:sz="6" w:space="0" w:color="8EAADB"/>
+              <w:right w:val="single" w:sz="6" w:space="0" w:color="8EAADB"/>
+            </w:tcBorders>
+            <w:tcMar>
+              <w:top w:w="80" w:type="dxa"/>
+              <w:left w:w="120" w:type="dxa"/>
+              <w:bottom w:w="80" w:type="dxa"/>
+              <w:right w:w="120" w:type="dxa"/>
+            </w:tcMar>
+            <w:hideMark/>
+          </w:tcPr>
+          <w:p>
+            <w:pPr>
+              <w:spacing w:before="160" w:after="160"/>
+              <w:rPr>
+                <w:rFonts w:ascii="Calibri" w:eastAsia="Times New Roman" w:hAnsi="Calibri" w:cs="Calibri"/>
+                <w:sz w:val="20"/>
+                <w:szCs w:val="20"/>
+              </w:rPr>
+            </w:pPr>
+            <w:r>
+              <w:rPr>
+                <w:rFonts w:ascii="Calibri" w:eastAsia="Times New Roman" w:hAnsi="Calibri" w:cs="Calibri"/>
+                <w:sz w:val="20"/>
+                <w:szCs w:val="20"/>
+              </w:rPr>
+              <w:t>____/____/________</w:t>
+            </w:r>
+          </w:p>
+        </w:tc>
+        <w:tc>
+          <w:tcPr>
+            <w:tcW w:w="0" w:type="auto"/>
+            <w:tcBorders>
+              <w:top w:val="single" w:sz="6" w:space="0" w:color="8EAADB"/>
+              <w:left w:val="single" w:sz="6" w:space="0" w:color="8EAADB"/>
+              <w:bottom w:val="single" w:sz="6" w:space="0" w:color="8EAADB"/>
+              <w:right w:val="single" w:sz="6" w:space="0" w:color="8EAADB"/>
+            </w:tcBorders>
+            <w:tcMar>
+              <w:top w:w="80" w:type="dxa"/>
+              <w:left w:w="120" w:type="dxa"/>
+              <w:bottom w:w="80" w:type="dxa"/>
+              <w:right w:w="120" w:type="dxa"/>
+            </w:tcMar>
+            <w:hideMark/>
+          </w:tcPr>
+          <w:p>
+            <w:pPr>
+              <w:spacing w:before="160" w:after="160"/>
+              <w:rPr>
+                <w:rFonts w:ascii="Calibri" w:eastAsia="Times New Roman" w:hAnsi="Calibri" w:cs="Calibri"/>
+                <w:sz w:val="20"/>
+                <w:szCs w:val="20"/>
+              </w:rPr>
+            </w:pPr>
+            <w:r>
+              <w:rPr>
+                <w:rStyle w:val="Fuerte"/>
+                <w:rFonts w:ascii="Calibri" w:eastAsia="Times New Roman" w:hAnsi="Calibri" w:cs="Calibri"/>
+                <w:sz w:val="20"/>
+                <w:szCs w:val="20"/>
+              </w:rPr>
+              <w:t>20%</w:t>
+            </w:r>
+            <w:r>
+              <w:rPr>
+                <w:rFonts w:ascii="Calibri" w:eastAsia="Times New Roman" w:hAnsi="Calibri" w:cs="Calibri"/>
+                <w:sz w:val="20"/>
+                <w:szCs w:val="20"/>
+              </w:rPr>
+              <w:t xml:space="preserve"> individual</w:t>
+            </w:r>
+          </w:p>
+        </w:tc>
+      </w:tr>
+      <w:tr>
+        <w:tc>
+          <w:tcPr>
+            <w:tcW w:w="0" w:type="auto"/>
+            <w:tcBorders>
+              <w:top w:val="single" w:sz="6" w:space="0" w:color="8EAADB"/>
+              <w:left w:val="single" w:sz="6" w:space="0" w:color="8EAADB"/>
+              <w:bottom w:val="single" w:sz="6" w:space="0" w:color="8EAADB"/>
+              <w:right w:val="single" w:sz="6" w:space="0" w:color="8EAADB"/>
+            </w:tcBorders>
+            <w:tcMar>
+              <w:top w:w="80" w:type="dxa"/>
+              <w:left w:w="120" w:type="dxa"/>
+              <w:bottom w:w="80" w:type="dxa"/>
+              <w:right w:w="120" w:type="dxa"/>
+            </w:tcMar>
+            <w:hideMark/>
+          </w:tcPr>
+          <w:p>
+            <w:pPr>
+              <w:spacing w:before="160" w:after="160"/>
+              <w:rPr>
+                <w:rFonts w:ascii="Calibri" w:eastAsia="Times New Roman" w:hAnsi="Calibri" w:cs="Calibri"/>
+                <w:sz w:val="20"/>
+                <w:szCs w:val="20"/>
+              </w:rPr>
+            </w:pPr>
+            <w:r>
+              <w:rPr>
+                <w:rStyle w:val="Fuerte"/>
+                <w:rFonts w:ascii="Calibri" w:eastAsia="Times New Roman" w:hAnsi="Calibri" w:cs="Calibri"/>
+                <w:sz w:val="20"/>
+                <w:szCs w:val="20"/>
+              </w:rPr>
+              <w:t>Entrega versión 1</w:t>
+            </w:r>
+          </w:p>
+        </w:tc>
+        <w:tc>
+          <w:tcPr>
+            <w:tcW w:w="0" w:type="auto"/>
+            <w:tcBorders>
+              <w:top w:val="single" w:sz="6" w:space="0" w:color="8EAADB"/>
+              <w:left w:val="single" w:sz="6" w:space="0" w:color="8EAADB"/>
+              <w:bottom w:val="single" w:sz="6" w:space="0" w:color="8EAADB"/>
+              <w:right w:val="single" w:sz="6" w:space="0" w:color="8EAADB"/>
+            </w:tcBorders>
+            <w:tcMar>
+              <w:top w:w="80" w:type="dxa"/>
+              <w:left w:w="120" w:type="dxa"/>
+              <w:bottom w:w="80" w:type="dxa"/>
+              <w:right w:w="120" w:type="dxa"/>
+            </w:tcMar>
+            <w:hideMark/>
+          </w:tcPr>
+          <w:p>
+            <w:pPr>
+              <w:spacing w:before="160" w:after="160"/>
+              <w:rPr>
+                <w:rFonts w:ascii="Calibri" w:eastAsia="Times New Roman" w:hAnsi="Calibri" w:cs="Calibri"/>
+                <w:sz w:val="20"/>
+                <w:szCs w:val="20"/>
+              </w:rPr>
+            </w:pPr>
+            <w:r>
+              <w:rPr>
+                <w:rFonts w:ascii="Calibri" w:eastAsia="Times New Roman" w:hAnsi="Calibri" w:cs="Calibri"/>
+                <w:sz w:val="20"/>
+                <w:szCs w:val="20"/>
+              </w:rPr>
+              <w:t xml:space="preserve">Última semana de </w:t>
+            </w:r>
+            <w:r>
+              <w:rPr>
+                <w:rStyle w:val="Fuerte"/>
+                <w:rFonts w:ascii="Calibri" w:eastAsia="Times New Roman" w:hAnsi="Calibri" w:cs="Calibri"/>
+                <w:sz w:val="20"/>
+                <w:szCs w:val="20"/>
+              </w:rPr>
+              <w:t>septiembre</w:t>
+            </w:r>
+          </w:p>
+        </w:tc>
+        <w:tc>
+          <w:tcPr>
+            <w:tcW w:w="0" w:type="auto"/>
+            <w:tcBorders>
+              <w:top w:val="single" w:sz="6" w:space="0" w:color="8EAADB"/>
+              <w:left w:val="single" w:sz="6" w:space="0" w:color="8EAADB"/>
+              <w:bottom w:val="single" w:sz="6" w:space="0" w:color="8EAADB"/>
+              <w:right w:val="single" w:sz="6" w:space="0" w:color="8EAADB"/>
+            </w:tcBorders>
+            <w:tcMar>
+              <w:top w:w="80" w:type="dxa"/>
+              <w:left w:w="120" w:type="dxa"/>
+              <w:bottom w:w="80" w:type="dxa"/>
+              <w:right w:w="120" w:type="dxa"/>
+            </w:tcMar>
+            <w:hideMark/>
+          </w:tcPr>
+          <w:p>
+            <w:pPr>
+              <w:spacing w:before="160" w:after="160"/>
+              <w:rPr>
+                <w:rFonts w:ascii="Calibri" w:eastAsia="Times New Roman" w:hAnsi="Calibri" w:cs="Calibri"/>
+                <w:sz w:val="20"/>
+                <w:szCs w:val="20"/>
+              </w:rPr>
+            </w:pPr>
+            <w:r>
+              <w:rPr>
+                <w:rFonts w:ascii="Calibri" w:eastAsia="Times New Roman" w:hAnsi="Calibri" w:cs="Calibri"/>
+                <w:sz w:val="20"/>
+                <w:szCs w:val="20"/>
+              </w:rPr>
+              <w:t>____/____/________</w:t>
+            </w:r>
+          </w:p>
+        </w:tc>
+        <w:tc>
+          <w:tcPr>
+            <w:tcW w:w="0" w:type="auto"/>
+            <w:tcBorders>
+              <w:top w:val="single" w:sz="6" w:space="0" w:color="8EAADB"/>
+              <w:left w:val="single" w:sz="6" w:space="0" w:color="8EAADB"/>
+              <w:bottom w:val="single" w:sz="6" w:space="0" w:color="8EAADB"/>
+              <w:right w:val="single" w:sz="6" w:space="0" w:color="8EAADB"/>
+            </w:tcBorders>
+            <w:tcMar>
+              <w:top w:w="80" w:type="dxa"/>
+              <w:left w:w="120" w:type="dxa"/>
+              <w:bottom w:w="80" w:type="dxa"/>
+              <w:right w:w="120" w:type="dxa"/>
+            </w:tcMar>
+            <w:hideMark/>
+          </w:tcPr>
+          <w:p>
+            <w:pPr>
+              <w:spacing w:before="160" w:after="160"/>
+              <w:rPr>
+                <w:rFonts w:ascii="Calibri" w:eastAsia="Times New Roman" w:hAnsi="Calibri" w:cs="Calibri"/>
+                <w:sz w:val="20"/>
+                <w:szCs w:val="20"/>
+              </w:rPr>
+            </w:pPr>
+            <w:r>
+              <w:rPr>
+                <w:rStyle w:val="Fuerte"/>
+                <w:rFonts w:ascii="Calibri" w:eastAsia="Times New Roman" w:hAnsi="Calibri" w:cs="Calibri"/>
+                <w:sz w:val="20"/>
+                <w:szCs w:val="20"/>
+              </w:rPr>
+              <w:t>20%</w:t>
+            </w:r>
+            <w:r>
+              <w:rPr>
+                <w:rFonts w:ascii="Calibri" w:eastAsia="Times New Roman" w:hAnsi="Calibri" w:cs="Calibri"/>
+                <w:sz w:val="20"/>
+                <w:szCs w:val="20"/>
+              </w:rPr>
+              <w:t xml:space="preserve"> </w:t>
+            </w:r>
+            <w:r>
+              <w:rPr>
+                <w:rFonts w:ascii="Calibri" w:eastAsia="Times New Roman" w:hAnsi="Calibri" w:cs="Calibri"/>
+                <w:sz w:val="20"/>
+                <w:szCs w:val="20"/>
+              </w:rPr>
+              <w:t>— 10% sustentación individual (incluidos los commits) + 10% entrega en equipo</w:t>
+            </w:r>
+          </w:p>
+        </w:tc>
+      </w:tr>
+      <w:tr>
+        <w:tc>
+          <w:tcPr>
+            <w:tcW w:w="0" w:type="auto"/>
+            <w:tcBorders>
+              <w:top w:val="single" w:sz="6" w:space="0" w:color="8EAADB"/>
+              <w:left w:val="single" w:sz="6" w:space="0" w:color="8EAADB"/>
+              <w:bottom w:val="single" w:sz="6" w:space="0" w:color="8EAADB"/>
+              <w:right w:val="single" w:sz="6" w:space="0" w:color="8EAADB"/>
+            </w:tcBorders>
+            <w:tcMar>
+              <w:top w:w="80" w:type="dxa"/>
+              <w:left w:w="120" w:type="dxa"/>
+              <w:bottom w:w="80" w:type="dxa"/>
+              <w:right w:w="120" w:type="dxa"/>
+            </w:tcMar>
+            <w:hideMark/>
+          </w:tcPr>
+          <w:p>
+            <w:pPr>
+              <w:spacing w:before="160" w:after="160"/>
+              <w:rPr>
+                <w:rFonts w:ascii="Calibri" w:eastAsia="Times New Roman" w:hAnsi="Calibri" w:cs="Calibri"/>
+                <w:sz w:val="20"/>
+                <w:szCs w:val="20"/>
+              </w:rPr>
+            </w:pPr>
+            <w:r>
+              <w:rPr>
+                <w:rStyle w:val="Fuerte"/>
+                <w:rFonts w:ascii="Calibri" w:eastAsia="Times New Roman" w:hAnsi="Calibri" w:cs="Calibri"/>
+                <w:sz w:val="20"/>
+                <w:szCs w:val="20"/>
+              </w:rPr>
+              <w:t>Entrega versión 2</w:t>
+            </w:r>
+          </w:p>
+        </w:tc>
+        <w:tc>
+          <w:tcPr>
+            <w:tcW w:w="0" w:type="auto"/>
+            <w:tcBorders>
+              <w:top w:val="single" w:sz="6" w:space="0" w:color="8EAADB"/>
+              <w:left w:val="single" w:sz="6" w:space="0" w:color="8EAADB"/>
+              <w:bottom w:val="single" w:sz="6" w:space="0" w:color="8EAADB"/>
+              <w:right w:val="single" w:sz="6" w:space="0" w:color="8EAADB"/>
+            </w:tcBorders>
+            <w:tcMar>
+              <w:top w:w="80" w:type="dxa"/>
+              <w:left w:w="120" w:type="dxa"/>
+              <w:bottom w:w="80" w:type="dxa"/>
+              <w:right w:w="120" w:type="dxa"/>
+            </w:tcMar>
+            <w:hideMark/>
+          </w:tcPr>
+          <w:p>
+            <w:pPr>
+              <w:spacing w:before="160" w:after="160"/>
+              <w:rPr>
+                <w:rFonts w:ascii="Calibri" w:eastAsia="Times New Roman" w:hAnsi="Calibri" w:cs="Calibri"/>
+                <w:sz w:val="20"/>
+                <w:szCs w:val="20"/>
+              </w:rPr>
+            </w:pPr>
+            <w:r>
+              <w:rPr>
+                <w:rFonts w:ascii="Calibri" w:eastAsia="Times New Roman" w:hAnsi="Calibri" w:cs="Calibri"/>
+                <w:sz w:val="20"/>
+                <w:szCs w:val="20"/>
+              </w:rPr>
+              <w:t xml:space="preserve">Última semana de </w:t>
+            </w:r>
+            <w:r>
+              <w:rPr>
+                <w:rStyle w:val="Fuerte"/>
+                <w:rFonts w:ascii="Calibri" w:eastAsia="Times New Roman" w:hAnsi="Calibri" w:cs="Calibri"/>
+                <w:sz w:val="20"/>
+                <w:szCs w:val="20"/>
+              </w:rPr>
+              <w:t>octubre</w:t>
+            </w:r>
+          </w:p>
+        </w:tc>
+        <w:tc>
+          <w:tcPr>
+            <w:tcW w:w="0" w:type="auto"/>
+            <w:tcBorders>
+              <w:top w:val="single" w:sz="6" w:space="0" w:color="8EAADB"/>
+              <w:left w:val="single" w:sz="6" w:space="0" w:color="8EAADB"/>
+              <w:bottom w:val="single" w:sz="6" w:space="0" w:color="8EAADB"/>
+              <w:right w:val="single" w:sz="6" w:space="0" w:color="8EAADB"/>
+            </w:tcBorders>
+            <w:tcMar>
+              <w:top w:w="80" w:type="dxa"/>
+              <w:left w:w="120" w:type="dxa"/>
+              <w:bottom w:w="80" w:type="dxa"/>
+              <w:right w:w="120" w:type="dxa"/>
+            </w:tcMar>
+            <w:hideMark/>
+          </w:tcPr>
+          <w:p>
+            <w:pPr>
+              <w:spacing w:before="160" w:after="160"/>
+              <w:rPr>
+                <w:rFonts w:ascii="Calibri" w:eastAsia="Times New Roman" w:hAnsi="Calibri" w:cs="Calibri"/>
+                <w:sz w:val="20"/>
+                <w:szCs w:val="20"/>
+              </w:rPr>
+            </w:pPr>
+            <w:r>
+              <w:rPr>
+                <w:rFonts w:ascii="Calibri" w:eastAsia="Times New Roman" w:hAnsi="Calibri" w:cs="Calibri"/>
+                <w:sz w:val="20"/>
+                <w:szCs w:val="20"/>
+              </w:rPr>
+              <w:t>____/____/________</w:t>
+            </w:r>
+          </w:p>
+        </w:tc>
+        <w:tc>
+          <w:tcPr>
+            <w:tcW w:w="0" w:type="auto"/>
+            <w:tcBorders>
+              <w:top w:val="single" w:sz="6" w:space="0" w:color="8EAADB"/>
+              <w:left w:val="single" w:sz="6" w:space="0" w:color="8EAADB"/>
+              <w:bottom w:val="single" w:sz="6" w:space="0" w:color="8EAADB"/>
+              <w:right w:val="single" w:sz="6" w:space="0" w:color="8EAADB"/>
+            </w:tcBorders>
+            <w:tcMar>
+              <w:top w:w="80" w:type="dxa"/>
+              <w:left w:w="120" w:type="dxa"/>
+              <w:bottom w:w="80" w:type="dxa"/>
+              <w:right w:w="120" w:type="dxa"/>
+            </w:tcMar>
+            <w:hideMark/>
+          </w:tcPr>
+          <w:p>
+            <w:pPr>
+              <w:spacing w:before="160" w:after="160"/>
+              <w:rPr>
+                <w:rFonts w:ascii="Calibri" w:eastAsia="Times New Roman" w:hAnsi="Calibri" w:cs="Calibri"/>
+                <w:sz w:val="20"/>
+                <w:szCs w:val="20"/>
+              </w:rPr>
+            </w:pPr>
+            <w:r>
+              <w:rPr>
+                <w:rStyle w:val="Fuerte"/>
+                <w:rFonts w:ascii="Calibri" w:eastAsia="Times New Roman" w:hAnsi="Calibri" w:cs="Calibri"/>
+                <w:sz w:val="20"/>
+                <w:szCs w:val="20"/>
+              </w:rPr>
+              <w:t>20%</w:t>
+            </w:r>
+            <w:r>
+              <w:rPr>
+                <w:rFonts w:ascii="Calibri" w:eastAsia="Times New Roman" w:hAnsi="Calibri" w:cs="Calibri"/>
+                <w:sz w:val="20"/>
+                <w:szCs w:val="20"/>
+              </w:rPr>
+              <w:t xml:space="preserve"> — 10% sustentación individual (incluidos los commits) + 10% entrega en equipo</w:t>
+            </w:r>
+          </w:p>
+        </w:tc>
+      </w:tr>
+      <w:tr>
+        <w:tc>
+          <w:tcPr>
+            <w:tcW w:w="0" w:type="auto"/>
+            <w:tcBorders>
+              <w:top w:val="single" w:sz="6" w:space="0" w:color="8EAADB"/>
+              <w:left w:val="single" w:sz="6" w:space="0" w:color="8EAADB"/>
+              <w:bottom w:val="single" w:sz="6" w:space="0" w:color="8EAADB"/>
+              <w:right w:val="single" w:sz="6" w:space="0" w:color="8EAADB"/>
+            </w:tcBorders>
+            <w:tcMar>
+              <w:top w:w="80" w:type="dxa"/>
+              <w:left w:w="120" w:type="dxa"/>
+              <w:bottom w:w="80" w:type="dxa"/>
+              <w:right w:w="120" w:type="dxa"/>
+            </w:tcMar>
+            <w:hideMark/>
+          </w:tcPr>
+          <w:p>
+            <w:pPr>
+              <w:spacing w:before="160" w:after="160"/>
+              <w:rPr>
+                <w:rFonts w:ascii="Calibri" w:eastAsia="Times New Roman" w:hAnsi="Calibri" w:cs="Calibri"/>
+                <w:sz w:val="20"/>
+                <w:szCs w:val="20"/>
+              </w:rPr>
+            </w:pPr>
+            <w:r>
+              <w:rPr>
+                <w:rStyle w:val="Fuerte"/>
+                <w:rFonts w:ascii="Calibri" w:eastAsia="Times New Roman" w:hAnsi="Calibri" w:cs="Calibri"/>
+                <w:sz w:val="20"/>
+                <w:szCs w:val="20"/>
+              </w:rPr>
+              <w:lastRenderedPageBreak/>
+              <w:t>Entrega versión 3</w:t>
+            </w:r>
+          </w:p>
+        </w:tc>
+        <w:tc>
+          <w:tcPr>
+            <w:tcW w:w="0" w:type="auto"/>
+            <w:tcBorders>
+              <w:top w:val="single" w:sz="6" w:space="0" w:color="8EAADB"/>
+              <w:left w:val="single" w:sz="6" w:space="0" w:color="8EAADB"/>
+              <w:bottom w:val="single" w:sz="6" w:space="0" w:color="8EAADB"/>
+              <w:right w:val="single" w:sz="6" w:space="0" w:color="8EAADB"/>
+            </w:tcBorders>
+            <w:tcMar>
+              <w:top w:w="80" w:type="dxa"/>
+              <w:left w:w="120" w:type="dxa"/>
+              <w:bottom w:w="80" w:type="dxa"/>
+              <w:right w:w="120" w:type="dxa"/>
+            </w:tcMar>
+            <w:hideMark/>
+          </w:tcPr>
+          <w:p>
+            <w:pPr>
+              <w:spacing w:before="160" w:after="160"/>
+              <w:rPr>
+                <w:rFonts w:ascii="Calibri" w:eastAsia="Times New Roman" w:hAnsi="Calibri" w:cs="Calibri"/>
+                <w:sz w:val="20"/>
+                <w:szCs w:val="20"/>
+              </w:rPr>
+            </w:pPr>
+            <w:r>
+              <w:rPr>
+                <w:rFonts w:ascii="Calibri" w:eastAsia="Times New Roman" w:hAnsi="Calibri" w:cs="Calibri"/>
+                <w:sz w:val="20"/>
+                <w:szCs w:val="20"/>
+              </w:rPr>
+              <w:t xml:space="preserve">Segunda semana de </w:t>
+            </w:r>
+            <w:r>
+              <w:rPr>
+                <w:rStyle w:val="Fuerte"/>
+                <w:rFonts w:ascii="Calibri" w:eastAsia="Times New Roman" w:hAnsi="Calibri" w:cs="Calibri"/>
+                <w:sz w:val="20"/>
+                <w:szCs w:val="20"/>
+              </w:rPr>
+              <w:t>noviembre</w:t>
+            </w:r>
+          </w:p>
+        </w:tc>
+        <w:tc>
+          <w:tcPr>
+            <w:tcW w:w="0" w:type="auto"/>
+            <w:tcBorders>
+              <w:top w:val="single" w:sz="6" w:space="0" w:color="8EAADB"/>
+              <w:left w:val="single" w:sz="6" w:space="0" w:color="8EAADB"/>
+              <w:bottom w:val="single" w:sz="6" w:space="0" w:color="8EAADB"/>
+              <w:right w:val="single" w:sz="6" w:space="0" w:color="8EAADB"/>
+            </w:tcBorders>
+            <w:tcMar>
+              <w:top w:w="80" w:type="dxa"/>
+              <w:left w:w="120" w:type="dxa"/>
+              <w:bottom w:w="80" w:type="dxa"/>
+              <w:right w:w="120" w:type="dxa"/>
+            </w:tcMar>
+            <w:hideMark/>
+          </w:tcPr>
+          <w:p>
+            <w:pPr>
+              <w:spacing w:before="160" w:after="160"/>
+              <w:rPr>
+                <w:rFonts w:ascii="Calibri" w:eastAsia="Times New Roman" w:hAnsi="Calibri" w:cs="Calibri"/>
+                <w:sz w:val="20"/>
+                <w:szCs w:val="20"/>
+              </w:rPr>
+            </w:pPr>
+            <w:r>
+              <w:rPr>
+                <w:rFonts w:ascii="Calibri" w:eastAsia="Times New Roman" w:hAnsi="Calibri" w:cs="Calibri"/>
+                <w:sz w:val="20"/>
+                <w:szCs w:val="20"/>
+              </w:rPr>
+              <w:t>____/____/________</w:t>
+            </w:r>
+          </w:p>
+        </w:tc>
+        <w:tc>
+          <w:tcPr>
+            <w:tcW w:w="0" w:type="auto"/>
+            <w:tcBorders>
+              <w:top w:val="single" w:sz="6" w:space="0" w:color="8EAADB"/>
+              <w:left w:val="single" w:sz="6" w:space="0" w:color="8EAADB"/>
+              <w:bottom w:val="single" w:sz="6" w:space="0" w:color="8EAADB"/>
+              <w:right w:val="single" w:sz="6" w:space="0" w:color="8EAADB"/>
+            </w:tcBorders>
+            <w:tcMar>
+              <w:top w:w="80" w:type="dxa"/>
+              <w:left w:w="120" w:type="dxa"/>
+              <w:bottom w:w="80" w:type="dxa"/>
+              <w:right w:w="120" w:type="dxa"/>
+            </w:tcMar>
+            <w:hideMark/>
+          </w:tcPr>
+          <w:p>
+            <w:pPr>
+              <w:spacing w:before="160" w:after="160"/>
+              <w:rPr>
+                <w:rFonts w:ascii="Calibri" w:eastAsia="Times New Roman" w:hAnsi="Calibri" w:cs="Calibri"/>
+                <w:sz w:val="20"/>
+                <w:szCs w:val="20"/>
+              </w:rPr>
+            </w:pPr>
+            <w:r>
+              <w:rPr>
+                <w:rStyle w:val="Fuerte"/>
+                <w:rFonts w:ascii="Calibri" w:eastAsia="Times New Roman" w:hAnsi="Calibri" w:cs="Calibri"/>
+                <w:sz w:val="20"/>
+                <w:szCs w:val="20"/>
+              </w:rPr>
+              <w:t>20%</w:t>
+            </w:r>
+            <w:r>
+              <w:rPr>
+                <w:rFonts w:ascii="Calibri" w:eastAsia="Times New Roman" w:hAnsi="Calibri" w:cs="Calibri"/>
+                <w:sz w:val="20"/>
+                <w:szCs w:val="20"/>
+              </w:rPr>
+              <w:t xml:space="preserve"> — 10% sustentación individual (incluidos los commits) + 10% entrega en equipo</w:t>
+            </w:r>
+          </w:p>
+        </w:tc>
+      </w:tr>
+      <w:tr>
+        <w:tc>
+          <w:tcPr>
+            <w:tcW w:w="0" w:type="auto"/>
+            <w:tcBorders>
+              <w:top w:val="single" w:sz="6" w:space="0" w:color="8EAADB"/>
+              <w:left w:val="single" w:sz="6" w:space="0" w:color="8EAADB"/>
+              <w:bottom w:val="single" w:sz="6" w:space="0" w:color="8EAADB"/>
+              <w:right w:val="single" w:sz="6" w:space="0" w:color="8EAADB"/>
+            </w:tcBorders>
+            <w:tcMar>
+              <w:top w:w="80" w:type="dxa"/>
+              <w:left w:w="120" w:type="dxa"/>
+              <w:bottom w:w="80" w:type="dxa"/>
+              <w:right w:w="120" w:type="dxa"/>
+            </w:tcMar>
+            <w:hideMark/>
+          </w:tcPr>
+          <w:p>
+            <w:pPr>
+              <w:spacing w:before="160" w:after="160"/>
+              <w:rPr>
+                <w:rFonts w:ascii="Calibri" w:eastAsia="Times New Roman" w:hAnsi="Calibri" w:cs="Calibri"/>
+                <w:sz w:val="20"/>
+                <w:szCs w:val="20"/>
+              </w:rPr>
+            </w:pPr>
+            <w:r>
+              <w:rPr>
+                <w:rStyle w:val="Fuerte"/>
+                <w:rFonts w:ascii="Calibri" w:eastAsia="Times New Roman" w:hAnsi="Calibri" w:cs="Calibri"/>
+                <w:sz w:val="20"/>
+                <w:szCs w:val="20"/>
+              </w:rPr>
+              <w:t>Entrega versión 4</w:t>
+            </w:r>
+          </w:p>
+        </w:tc>
+        <w:tc>
+          <w:tcPr>
+            <w:tcW w:w="0" w:type="auto"/>
+            <w:tcBorders>
+              <w:top w:val="single" w:sz="6" w:space="0" w:color="8EAADB"/>
+              <w:left w:val="single" w:sz="6" w:space="0" w:color="8EAADB"/>
+              <w:bottom w:val="single" w:sz="6" w:space="0" w:color="8EAADB"/>
+              <w:right w:val="single" w:sz="6" w:space="0" w:color="8EAADB"/>
+            </w:tcBorders>
+            <w:tcMar>
+              <w:top w:w="80" w:type="dxa"/>
+              <w:left w:w="120" w:type="dxa"/>
+              <w:bottom w:w="80" w:type="dxa"/>
+              <w:right w:w="120" w:type="dxa"/>
+            </w:tcMar>
+            <w:hideMark/>
+          </w:tcPr>
+          <w:p>
+            <w:pPr>
+              <w:spacing w:before="160" w:after="160"/>
+              <w:rPr>
+                <w:rFonts w:ascii="Calibri" w:eastAsia="Times New Roman" w:hAnsi="Calibri" w:cs="Calibri"/>
+                <w:sz w:val="20"/>
+                <w:szCs w:val="20"/>
+              </w:rPr>
+            </w:pPr>
+            <w:r>
+              <w:rPr>
+                <w:rFonts w:ascii="Calibri" w:eastAsia="Times New Roman" w:hAnsi="Calibri" w:cs="Calibri"/>
+                <w:sz w:val="20"/>
+                <w:szCs w:val="20"/>
+              </w:rPr>
+              <w:t xml:space="preserve">Última semana de </w:t>
+            </w:r>
+            <w:r>
+              <w:rPr>
+                <w:rStyle w:val="Fuerte"/>
+                <w:rFonts w:ascii="Calibri" w:eastAsia="Times New Roman" w:hAnsi="Calibri" w:cs="Calibri"/>
+                <w:sz w:val="20"/>
+                <w:szCs w:val="20"/>
+              </w:rPr>
+              <w:t>noviembre</w:t>
+            </w:r>
+          </w:p>
+        </w:tc>
+        <w:tc>
+          <w:tcPr>
+            <w:tcW w:w="0" w:type="auto"/>
+            <w:tcBorders>
+              <w:top w:val="single" w:sz="6" w:space="0" w:color="8EAADB"/>
+              <w:left w:val="single" w:sz="6" w:space="0" w:color="8EAADB"/>
+              <w:bottom w:val="single" w:sz="6" w:space="0" w:color="8EAADB"/>
+              <w:right w:val="single" w:sz="6" w:space="0" w:color="8EAADB"/>
+            </w:tcBorders>
+            <w:tcMar>
+              <w:top w:w="80" w:type="dxa"/>
+              <w:left w:w="120" w:type="dxa"/>
+              <w:bottom w:w="80" w:type="dxa"/>
+              <w:right w:w="120" w:type="dxa"/>
+            </w:tcMar>
+            <w:hideMark/>
+          </w:tcPr>
+          <w:p>
+            <w:pPr>
+              <w:spacing w:before="160" w:after="160"/>
+              <w:rPr>
+                <w:rFonts w:ascii="Calibri" w:eastAsia="Times New Roman" w:hAnsi="Calibri" w:cs="Calibri"/>
+                <w:sz w:val="20"/>
+                <w:szCs w:val="20"/>
+              </w:rPr>
+            </w:pPr>
+            <w:r>
+              <w:rPr>
+                <w:rFonts w:ascii="Calibri" w:eastAsia="Times New Roman" w:hAnsi="Calibri" w:cs="Calibri"/>
+                <w:sz w:val="20"/>
+                <w:szCs w:val="20"/>
+              </w:rPr>
+              <w:t>____/____/________</w:t>
+            </w:r>
+          </w:p>
+        </w:tc>
+        <w:tc>
+          <w:tcPr>
+            <w:tcW w:w="0" w:type="auto"/>
+            <w:tcBorders>
+              <w:top w:val="single" w:sz="6" w:space="0" w:color="8EAADB"/>
+              <w:left w:val="single" w:sz="6" w:space="0" w:color="8EAADB"/>
+              <w:bottom w:val="single" w:sz="6" w:space="0" w:color="8EAADB"/>
+              <w:right w:val="single" w:sz="6" w:space="0" w:color="8EAADB"/>
+            </w:tcBorders>
+            <w:tcMar>
+              <w:top w:w="80" w:type="dxa"/>
+              <w:left w:w="120" w:type="dxa"/>
+              <w:bottom w:w="80" w:type="dxa"/>
+              <w:right w:w="120" w:type="dxa"/>
+            </w:tcMar>
+            <w:hideMark/>
+          </w:tcPr>
+          <w:p>
+            <w:pPr>
+              <w:spacing w:before="160" w:after="160"/>
+              <w:rPr>
+                <w:rFonts w:ascii="Calibri" w:eastAsia="Times New Roman" w:hAnsi="Calibri" w:cs="Calibri"/>
+                <w:sz w:val="20"/>
+                <w:szCs w:val="20"/>
+              </w:rPr>
+            </w:pPr>
+            <w:r>
+              <w:rPr>
+                <w:rStyle w:val="Fuerte"/>
+                <w:rFonts w:ascii="Calibri" w:eastAsia="Times New Roman" w:hAnsi="Calibri" w:cs="Calibri"/>
+                <w:sz w:val="20"/>
+                <w:szCs w:val="20"/>
+              </w:rPr>
+              <w:t>20%</w:t>
+            </w:r>
+            <w:r>
+              <w:rPr>
+                <w:rFonts w:ascii="Calibri" w:eastAsia="Times New Roman" w:hAnsi="Calibri" w:cs="Calibri"/>
+                <w:sz w:val="20"/>
+                <w:szCs w:val="20"/>
+              </w:rPr>
+              <w:t xml:space="preserve"> </w:t>
+            </w:r>
+            <w:r>
+              <w:rPr>
+                <w:rFonts w:ascii="Calibri" w:eastAsia="Times New Roman" w:hAnsi="Calibri" w:cs="Calibri"/>
+                <w:sz w:val="20"/>
+                <w:szCs w:val="20"/>
+              </w:rPr>
+              <w:t>— 10% sustentación individual (incluidos los commits) + 10% entrega en equipo</w:t>
+            </w:r>
+          </w:p>
+        </w:tc>
+      </w:tr>
+    </w:tbl>
+    <w:p>
+      <w:pPr>
+        <w:pStyle w:val="NormalWeb"/>
+        <w:shd w:val="clear" w:color="auto" w:fill="F2F6FC"/>
+        <w:divId w:val="45378908"/>
+        <w:rPr>
+          <w:rFonts w:ascii="Calibri" w:hAnsi="Calibri" w:cs="Calibri"/>
+          <w:sz w:val="22"/>
+          <w:szCs w:val="22"/>
+        </w:rPr>
+      </w:pPr>
+      <w:r>
+        <w:rPr>
+          <w:rStyle w:val="Fuerte"/>
+          <w:rFonts w:ascii="Calibri" w:hAnsi="Calibri" w:cs="Calibri"/>
+          <w:sz w:val="22"/>
+          <w:szCs w:val="22"/>
+        </w:rPr>
+        <w:t>"Incluidos los commits"</w:t>
+      </w:r>
+      <w:r>
+        <w:rPr>
+          <w:rFonts w:ascii="Calibri" w:hAnsi="Calibri" w:cs="Calibri"/>
+          <w:sz w:val="22"/>
+          <w:szCs w:val="22"/>
+        </w:rPr>
+        <w:t xml:space="preserve"> significa que en la sustentación individual cada estudiante responde por SU rama: qué hizo, por qué, y sus commits lo respaldan (frecuentes, descriptivos, propios). Una rama sin commits — o con un solo commit gigante la noche anterior — es una sustentación sin evidencia.</w:t>
       </w:r>
     </w:p>
     <w:p>
       <w:pPr>
-        <w:pStyle w:val="NormalWeb"/>
-        <w:rPr>
-          <w:rFonts w:ascii="Calibri" w:hAnsi="Calibri" w:cs="Calibri"/>
-          <w:sz w:val="22"/>
-          <w:szCs w:val="22"/>
-        </w:rPr>
-      </w:pPr>
-      <w:r>
-        <w:rPr>
-          <w:rFonts w:ascii="Calibri" w:hAnsi="Calibri" w:cs="Calibri"/>
-          <w:sz w:val="22"/>
-          <w:szCs w:val="22"/>
-        </w:rPr>
-        <w:t xml:space="preserve">Antes de programar cada versión, el equipo escribe su especificación en </w:t>
-      </w:r>
-      <w:r>
-        <w:rPr>
-          <w:rStyle w:val="CdigoHTML"/>
-        </w:rPr>
-        <w:t>docs/spec_kit/</w:t>
-      </w:r>
-      <w:r>
-        <w:rPr>
-          <w:rFonts w:ascii="Calibri" w:hAnsi="Calibri" w:cs="Calibri"/>
-          <w:sz w:val="22"/>
-          <w:szCs w:val="22"/>
-        </w:rPr>
-        <w:t xml:space="preserve"> del repositorio de la API (el mismo formato del curso):</w:t>
+        <w:pStyle w:val="Ttulo2"/>
+        <w:rPr>
+          <w:rFonts w:ascii="Calibri" w:eastAsia="Times New Roman" w:hAnsi="Calibri" w:cs="Calibri"/>
+        </w:rPr>
+      </w:pPr>
+      <w:r>
+        <w:rPr>
+          <w:rFonts w:ascii="Calibri" w:eastAsia="Times New Roman" w:hAnsi="Calibri" w:cs="Calibri"/>
+        </w:rPr>
+        <w:t>3. El spec kit que cada equipo ESCRIBE (por versión)</w:t>
       </w:r>
     </w:p>
     <w:p>
       <w:pPr>
-        <w:pStyle w:val="HTMLconformatoprevio"/>
+        <w:pStyle w:val="NormalWeb"/>
+        <w:rPr>
+          <w:rFonts w:ascii="Calibri" w:hAnsi="Calibri" w:cs="Calibri"/>
+          <w:sz w:val="22"/>
+          <w:szCs w:val="22"/>
+        </w:rPr>
+      </w:pPr>
+      <w:r>
+        <w:rPr>
+          <w:rFonts w:ascii="Calibri" w:hAnsi="Calibri" w:cs="Calibri"/>
+          <w:sz w:val="22"/>
+          <w:szCs w:val="22"/>
+        </w:rPr>
+        <w:t xml:space="preserve">Antes de programar cada versión, el equipo escribe su especificación en </w:t>
+      </w:r>
+      <w:r>
         <w:rPr>
           <w:rStyle w:val="CdigoHTML"/>
         </w:rPr>
-      </w:pPr>
-      <w:r>
-        <w:rPr>
-          <w:rStyle w:val="CdigoHTML"/>
-        </w:rPr>
         <w:t>docs/spec_kit/</w:t>
+      </w:r>
+      <w:r>
+        <w:rPr>
+          <w:rFonts w:ascii="Calibri" w:hAnsi="Calibri" w:cs="Calibri"/>
+          <w:sz w:val="22"/>
+          <w:szCs w:val="22"/>
+        </w:rPr>
+        <w:t xml:space="preserve"> del repositorio de la API (el mismo formato del curso):</w:t>
       </w:r>
     </w:p>
     <w:p>
@@ -1686,7 +2761,7 @@
         <w:rPr>
           <w:rStyle w:val="CdigoHTML"/>
         </w:rPr>
-        <w:t>├── 1_constitution.md            ← UNA vez (los principios del equipo: stack</w:t>
+        <w:t>docs/spec_kit/</w:t>
       </w:r>
     </w:p>
     <w:p>
@@ -1700,7 +2775,7 @@
         <w:rPr>
           <w:rStyle w:val="CdigoHTML"/>
         </w:rPr>
-        <w:t>│                                   elegido, capas, español, borrado lógico,</w:t>
+        <w:t>├── 1_constitution.md            ← UNA vez (los principios del equipo: stack</w:t>
       </w:r>
     </w:p>
     <w:p>
@@ -1714,13 +2789,7 @@
         <w:rPr>
           <w:rStyle w:val="CdigoHTML"/>
         </w:rPr>
-        <w:t xml:space="preserve">│                              </w:t>
-      </w:r>
-      <w:r>
-        <w:rPr>
-          <w:rStyle w:val="CdigoHTML"/>
-        </w:rPr>
-        <w:t xml:space="preserve">     secretos por variables de entorno…)</w:t>
+        <w:t>│                                   elegido, capas, español, borrado lógico,</w:t>
       </w:r>
     </w:p>
     <w:p>
@@ -1734,7 +2803,7 @@
         <w:rPr>
           <w:rStyle w:val="CdigoHTML"/>
         </w:rPr>
-        <w:t>└── versiones/</w:t>
+        <w:t>│                                   secretos por variables de entorno…)</w:t>
       </w:r>
     </w:p>
     <w:p>
@@ -1748,7 +2817,7 @@
         <w:rPr>
           <w:rStyle w:val="CdigoHTML"/>
         </w:rPr>
-        <w:t xml:space="preserve">    ├── 0_mapa_versiones.md      ← la tabla de la sección 2, con estados</w:t>
+        <w:t>└── versiones/</w:t>
       </w:r>
     </w:p>
     <w:p>
@@ -1762,7 +2831,7 @@
         <w:rPr>
           <w:rStyle w:val="CdigoHTML"/>
         </w:rPr>
-        <w:t xml:space="preserve">    ├── v1_&lt;nombre&gt;/             ← 2_spec.md · 3_plan.md · 4_research.md ·</w:t>
+        <w:t xml:space="preserve">    ├── 0_mapa_versiones.md      ← la tabla de la sección 2, con estados</w:t>
       </w:r>
     </w:p>
     <w:p>
@@ -1776,7 +2845,7 @@
         <w:rPr>
           <w:rStyle w:val="CdigoHTML"/>
         </w:rPr>
-        <w:t xml:space="preserve">    │                              5_data_model.md · 6_contracts.md ·</w:t>
+        <w:t xml:space="preserve">    ├── v1_&lt;nombre&gt;/             ← 2_spec.md · 3_plan.md · 4_research.md ·</w:t>
       </w:r>
     </w:p>
     <w:p>
@@ -1790,7 +2859,13 @@
         <w:rPr>
           <w:rStyle w:val="CdigoHTML"/>
         </w:rPr>
-        <w:t xml:space="preserve">    │                              7_quickstart.md · 8_tasks.md · GUIA_IA1.md*</w:t>
+        <w:t xml:space="preserve">    │                              </w:t>
+      </w:r>
+      <w:r>
+        <w:rPr>
+          <w:rStyle w:val="CdigoHTML"/>
+        </w:rPr>
+        <w:t>5_data_model.md · 6_contracts.md ·</w:t>
       </w:r>
     </w:p>
     <w:p>
@@ -1804,7 +2879,7 @@
         <w:rPr>
           <w:rStyle w:val="CdigoHTML"/>
         </w:rPr>
-        <w:t xml:space="preserve">    ├── v2_&lt;nombre&gt;/             ← los mismos 7+1, para el delta de la v2</w:t>
+        <w:t xml:space="preserve">    │                              7_quickstart.md · 8_tasks.md · GUIA_IA1.md*</w:t>
       </w:r>
     </w:p>
     <w:p>
@@ -1818,47 +2893,21 @@
         <w:rPr>
           <w:rStyle w:val="CdigoHTML"/>
         </w:rPr>
-        <w:t xml:space="preserve">    └── …</w:t>
+        <w:t xml:space="preserve">    ├── v2_&lt;nombre&gt;/             ← los mismos 7+1, para el delta de la v2</w:t>
       </w:r>
     </w:p>
     <w:p>
       <w:pPr>
-        <w:pStyle w:val="NormalWeb"/>
-        <w:rPr>
-          <w:rFonts w:ascii="Calibri" w:hAnsi="Calibri" w:cs="Calibri"/>
-          <w:sz w:val="22"/>
-          <w:szCs w:val="22"/>
-        </w:rPr>
-      </w:pPr>
-      <w:r>
-        <w:rPr>
-          <w:rFonts w:ascii="Calibri" w:hAnsi="Calibri" w:cs="Calibri"/>
-          <w:sz w:val="22"/>
-          <w:szCs w:val="22"/>
-        </w:rPr>
-        <w:t xml:space="preserve">* La </w:t>
-      </w:r>
-      <w:r>
+        <w:pStyle w:val="HTMLconformatoprevio"/>
         <w:rPr>
           <w:rStyle w:val="CdigoHTML"/>
         </w:rPr>
-        <w:t>GUIA_IA&lt;N&gt;.md</w:t>
-      </w:r>
-      <w:r>
-        <w:rPr>
-          <w:rFonts w:ascii="Calibri" w:hAnsi="Calibri" w:cs="Calibri"/>
-          <w:sz w:val="22"/>
-          <w:szCs w:val="22"/>
-        </w:rPr>
-        <w:t xml:space="preserve"> es opcional pero recomendada: si van a construir con </w:t>
-      </w:r>
-      <w:r>
-        <w:rPr>
-          <w:rFonts w:ascii="Calibri" w:hAnsi="Calibri" w:cs="Calibri"/>
-          <w:sz w:val="22"/>
-          <w:szCs w:val="22"/>
-        </w:rPr>
-        <w:t>ayuda de IA, escriban el prompt y las reglas COMO en las guías del curso — la IA sigue la spec, no improvisa. Copien la estructura de los repos de clase y adáptenla; eso ES el ejercicio.</w:t>
+      </w:pPr>
+      <w:r>
+        <w:rPr>
+          <w:rStyle w:val="CdigoHTML"/>
+        </w:rPr>
+        <w:t xml:space="preserve">    └── …</w:t>
       </w:r>
     </w:p>
     <w:p>
@@ -1872,6 +2921,38 @@
       </w:pPr>
       <w:r>
         <w:rPr>
+          <w:rFonts w:ascii="Calibri" w:hAnsi="Calibri" w:cs="Calibri"/>
+          <w:sz w:val="22"/>
+          <w:szCs w:val="22"/>
+        </w:rPr>
+        <w:t xml:space="preserve">* La </w:t>
+      </w:r>
+      <w:r>
+        <w:rPr>
+          <w:rStyle w:val="CdigoHTML"/>
+        </w:rPr>
+        <w:t>GUIA_IA&lt;N&gt;.md</w:t>
+      </w:r>
+      <w:r>
+        <w:rPr>
+          <w:rFonts w:ascii="Calibri" w:hAnsi="Calibri" w:cs="Calibri"/>
+          <w:sz w:val="22"/>
+          <w:szCs w:val="22"/>
+        </w:rPr>
+        <w:t xml:space="preserve"> es opcional pero recomendada: si van a construir con ayuda de IA, escriban el prompt y las reglas COMO en las guías del curso — la IA sigue la spec, no improvisa. Copien la estructura de los repos de clase y adáptenla; eso ES el ejercicio.</w:t>
+      </w:r>
+    </w:p>
+    <w:p>
+      <w:pPr>
+        <w:pStyle w:val="NormalWeb"/>
+        <w:rPr>
+          <w:rFonts w:ascii="Calibri" w:hAnsi="Calibri" w:cs="Calibri"/>
+          <w:sz w:val="22"/>
+          <w:szCs w:val="22"/>
+        </w:rPr>
+      </w:pPr>
+      <w:r>
+        <w:rPr>
           <w:rStyle w:val="Fuerte"/>
           <w:rFonts w:ascii="Calibri" w:hAnsi="Calibri" w:cs="Calibri"/>
           <w:sz w:val="22"/>
@@ -1916,7 +2997,6 @@
         <w:rPr>
           <w:rFonts w:ascii="Calibri" w:eastAsia="Times New Roman" w:hAnsi="Calibri" w:cs="Calibri"/>
         </w:rPr>
-        <w:lastRenderedPageBreak/>
         <w:t>4. Los dos repositorios (y las reglas de GitHub)</w:t>
       </w:r>
     </w:p>
@@ -2012,6 +3092,7 @@
                 <w:sz w:val="20"/>
                 <w:szCs w:val="20"/>
               </w:rPr>
+              <w:lastRenderedPageBreak/>
               <w:t>Repositorio</w:t>
             </w:r>
           </w:p>
@@ -2676,15 +3757,7 @@
           <w:sz w:val="22"/>
           <w:szCs w:val="22"/>
         </w:rPr>
-        <w:t xml:space="preserve">: el autor abre el PR desde su rama, el encargado del main lo revisa (¿compila? ¿cumple la spec? ¿los </w:t>
-      </w:r>
-      <w:r>
-        <w:rPr>
-          <w:rFonts w:ascii="Calibri" w:eastAsia="Times New Roman" w:hAnsi="Calibri" w:cs="Calibri"/>
-          <w:sz w:val="22"/>
-          <w:szCs w:val="22"/>
-        </w:rPr>
-        <w:t>criterios siguen pasando?) y SOLO el encargado hace el merge.</w:t>
+        <w:t>: el autor abre el PR desde su rama, el encargado del main lo revisa (¿compila? ¿cumple la spec? ¿los criterios siguen pasando?) y SOLO el encargado hace el merge.</w:t>
       </w:r>
     </w:p>
     <w:p>
@@ -2914,7 +3987,7 @@
       <w:pPr>
         <w:pStyle w:val="NormalWeb"/>
         <w:shd w:val="clear" w:color="auto" w:fill="F2F6FC"/>
-        <w:divId w:val="1103191293"/>
+        <w:divId w:val="1832259719"/>
         <w:rPr>
           <w:rFonts w:ascii="Calibri" w:hAnsi="Calibri" w:cs="Calibri"/>
           <w:sz w:val="22"/>
@@ -2953,15 +4026,7 @@
           <w:sz w:val="22"/>
           <w:szCs w:val="22"/>
         </w:rPr>
-        <w:t xml:space="preserve">: es un entorno de juguete que corre en su PC y </w:t>
-      </w:r>
-      <w:r>
-        <w:rPr>
-          <w:rFonts w:ascii="Calibri" w:hAnsi="Calibri" w:cs="Calibri"/>
-          <w:sz w:val="22"/>
-          <w:szCs w:val="22"/>
-        </w:rPr>
-        <w:t xml:space="preserve">jamás se despliega. El proyecto de aula es distinto — </w:t>
+        <w:t xml:space="preserve">: es un entorno de juguete que corre en su PC y jamás se despliega. El proyecto de aula es distinto — </w:t>
       </w:r>
       <w:r>
         <w:rPr>
@@ -2996,6 +4061,7 @@
           <w:sz w:val="22"/>
           <w:szCs w:val="22"/>
         </w:rPr>
+        <w:lastRenderedPageBreak/>
         <w:t>Cómo cumplirla:</w:t>
       </w:r>
     </w:p>
@@ -3212,7 +4278,15 @@
           <w:sz w:val="22"/>
           <w:szCs w:val="22"/>
         </w:rPr>
-        <w:t>En el servidor gratuito de la v4, los secretos se configuran en el panel de variables de entorno del servicio — jamás en el código desplegado.</w:t>
+        <w:t xml:space="preserve">En el servidor gratuito de la v4, los secretos se configuran en el </w:t>
+      </w:r>
+      <w:r>
+        <w:rPr>
+          <w:rFonts w:ascii="Calibri" w:eastAsia="Times New Roman" w:hAnsi="Calibri" w:cs="Calibri"/>
+          <w:sz w:val="22"/>
+          <w:szCs w:val="22"/>
+        </w:rPr>
+        <w:t>panel de variables de entorno del servicio — jamás en el código desplegado.</w:t>
       </w:r>
     </w:p>
     <w:p>
@@ -3500,15 +4574,7 @@
           <w:sz w:val="22"/>
           <w:szCs w:val="22"/>
         </w:rPr>
-        <w:t xml:space="preserve"> entrega el JWT; middleware de </w:t>
-      </w:r>
-      <w:r>
-        <w:rPr>
-          <w:rFonts w:ascii="Calibri" w:eastAsia="Times New Roman" w:hAnsi="Calibri" w:cs="Calibri"/>
-          <w:sz w:val="22"/>
-          <w:szCs w:val="22"/>
-        </w:rPr>
-        <w:t xml:space="preserve">autenticación y de autorización por roles; el frontend guarda el token, lo envía en </w:t>
+        <w:t xml:space="preserve"> entrega el JWT; middleware de autenticación y de autorización por roles; el frontend guarda el token, lo envía en </w:t>
       </w:r>
       <w:r>
         <w:rPr>
@@ -3539,7 +4605,15 @@
           <w:sz w:val="22"/>
           <w:szCs w:val="22"/>
         </w:rPr>
-        <w:t xml:space="preserve"> (bcrypt o equivalente), nunca en texto plano.</w:t>
+        <w:t xml:space="preserve"> </w:t>
+      </w:r>
+      <w:r>
+        <w:rPr>
+          <w:rFonts w:ascii="Calibri" w:eastAsia="Times New Roman" w:hAnsi="Calibri" w:cs="Calibri"/>
+          <w:sz w:val="22"/>
+          <w:szCs w:val="22"/>
+        </w:rPr>
+        <w:t>(bcrypt o equivalente), nunca en texto plano.</w:t>
       </w:r>
     </w:p>
     <w:p>
@@ -3570,15 +4644,7 @@
           <w:sz w:val="22"/>
           <w:szCs w:val="22"/>
         </w:rPr>
-        <w:t xml:space="preserve">: 10 consultas multitabla (mínimo 4 tablas cada una) expuestas como endpoints y presentadas en el dashboard con gráficos; páginas corporativas (Home, Productos/Servicios, Soporte, Contacto, </w:t>
-      </w:r>
-      <w:r>
-        <w:rPr>
-          <w:rFonts w:ascii="Calibri" w:eastAsia="Times New Roman" w:hAnsi="Calibri" w:cs="Calibri"/>
-          <w:sz w:val="22"/>
-          <w:szCs w:val="22"/>
-        </w:rPr>
-        <w:t>Sobre Nosotros) con imagen corporativa de la empresa hipotética; diseño responsive (PWA si es posible); publicación en servidor gratuito según el stack (las opciones están en el documento de su módulo original y las valida el profesor).</w:t>
+        <w:t>: 10 consultas multitabla (mínimo 4 tablas cada una) expuestas como endpoints y presentadas en el dashboard con gráficos; páginas corporativas (Home, Productos/Servicios, Soporte, Contacto, Sobre Nosotros) con imagen corporativa de la empresa hipotética; diseño responsive (PWA si es posible); publicación en servidor gratuito según el stack (las opciones están en el documento de su módulo original y las valida el profesor).</w:t>
       </w:r>
     </w:p>
     <w:p>
@@ -3654,15 +4720,7 @@
           <w:sz w:val="22"/>
           <w:szCs w:val="22"/>
         </w:rPr>
-        <w:t xml:space="preserve">: cada equipo elige su lenguaje/framework con aprobación del </w:t>
-      </w:r>
-      <w:r>
-        <w:rPr>
-          <w:rFonts w:ascii="Calibri" w:eastAsia="Times New Roman" w:hAnsi="Calibri" w:cs="Calibri"/>
-          <w:sz w:val="22"/>
-          <w:szCs w:val="22"/>
-        </w:rPr>
-        <w:t>profesor — la metodología y los contratos son los mismos en cualquier stack (esa es la gracia).</w:t>
+        <w:t>: cada equipo elige su lenguaje/framework con aprobación del profesor — la metodología y los contratos son los mismos en cualquier stack (esa es la gracia).</w:t>
       </w:r>
     </w:p>
     <w:p>
@@ -3754,6 +4812,7 @@
                 <w:sz w:val="20"/>
                 <w:szCs w:val="20"/>
               </w:rPr>
+              <w:lastRenderedPageBreak/>
               <w:t>Criterio</w:t>
             </w:r>
           </w:p>
@@ -5021,7 +6080,15 @@
           <w:sz w:val="22"/>
           <w:szCs w:val="22"/>
         </w:rPr>
-        <w:t xml:space="preserve"> puesto) + evidencia del quickstart de su spec pasando. En la v4, además: URL del sitio publicado.</w:t>
+        <w:t xml:space="preserve"> </w:t>
+      </w:r>
+      <w:r>
+        <w:rPr>
+          <w:rFonts w:ascii="Calibri" w:hAnsi="Calibri" w:cs="Calibri"/>
+          <w:sz w:val="22"/>
+          <w:szCs w:val="22"/>
+        </w:rPr>
+        <w:t>puesto) + evidencia del quickstart de su spec pasando. En la v4, además: URL del sitio publicado.</w:t>
       </w:r>
     </w:p>
     <w:sectPr>
@@ -5037,9 +6104,9 @@
 <file path=word/numbering.xml><?xml version="1.0" encoding="utf-8"?>
 <w:numbering xmlns:wpc="http://schemas.microsoft.com/office/word/2010/wordprocessingCanvas" xmlns:cx="http://schemas.microsoft.com/office/drawing/2014/chartex" xmlns:cx1="http://schemas.microsoft.com/office/drawing/2015/9/8/chartex" xmlns:cx2="http://schemas.microsoft.com/office/drawing/2015/10/21/chartex" xmlns:cx3="http://schemas.microsoft.com/office/drawing/2016/5/9/chartex" xmlns:cx4="http://schemas.microsoft.com/office/drawing/2016/5/10/chartex" xmlns:cx5="http://schemas.microsoft.com/office/drawing/2016/5/11/chartex" xmlns:cx6="http://schemas.microsoft.com/office/drawing/2016/5/12/chartex" xmlns:cx7="http://schemas.microsoft.com/office/drawing/2016/5/13/chartex" xmlns:cx8="http://schemas.microsoft.com/office/drawing/2016/5/14/chartex" xmlns:mc="http://schemas.openxmlformats.org/markup-compatibility/2006" xmlns:aink="http://schemas.microsoft.com/office/drawing/2016/ink" xmlns:am3d="http://schemas.microsoft.com/office/drawing/2017/model3d" xmlns:o="urn:schemas-microsoft-com:office:office" xmlns:oel="http://schemas.microsoft.com/office/2019/extlst" xmlns:r="http://schemas.openxmlformats.org/officeDocument/2006/relationships" xmlns:m="http://schemas.openxmlformats.org/officeDocument/2006/math" xmlns:v="urn:schemas-microsoft-com:vml" xmlns:wp14="http://schemas.microsoft.com/office/word/2010/wordprocessingDrawing" xmlns:wp="http://schemas.openxmlformats.org/drawingml/2006/wordprocessingDrawing" xmlns:w10="urn:schemas-microsoft-com:office:word" xmlns:w="http://schemas.openxmlformats.org/wordprocessingml/2006/main" xmlns:w14="http://schemas.microsoft.com/office/word/2010/wordml" xmlns:w15="http://schemas.microsoft.com/office/word/2012/wordml" xmlns:w16cei="http://schemas.microsoft.com/office/word/2026/wordml/cei" xmlns:w16cex="http://schemas.microsoft.com/office/word/2018/wordml/cex" xmlns:w16cid="http://schemas.microsoft.com/office/word/2016/wordml/cid" xmlns:w16="http://schemas.microsoft.com/office/word/2018/wordml" xmlns:w16du="http://schemas.microsoft.com/office/word/2023/wordml/word16du" xmlns:w16sdtdh="http://schemas.microsoft.com/office/word/2020/wordml/sdtdatahash" xmlns:w16sdtfl="http://schemas.microsoft.com/office/word/2024/wordml/sdtformatlock" xmlns:w16se="http://schemas.microsoft.com/office/word/2015/wordml/symex" xmlns:wpg="http://schemas.microsoft.com/office/word/2010/wordprocessingGroup" xmlns:wpi="http://schemas.microsoft.com/office/word/2010/wordprocessingInk" xmlns:wne="http://schemas.microsoft.com/office/word/2006/wordml" xmlns:wps="http://schemas.microsoft.com/office/word/2010/wordprocessingShape" mc:Ignorable="w14 w15 w16se w16cid w16 w16cex w16sdtdh w16sdtfl w16du wp14">
   <w:abstractNum w:abstractNumId="0" w15:restartNumberingAfterBreak="0">
-    <w:nsid w:val="0566526D"/>
+    <w:nsid w:val="1A4F0729"/>
     <w:multiLevelType w:val="multilevel"/>
-    <w:tmpl w:val="CC7410CA"/>
+    <w:tmpl w:val="D6E80EE6"/>
     <w:lvl w:ilvl="0">
       <w:start w:val="1"/>
       <w:numFmt w:val="decimal"/>
@@ -5150,9 +6217,9 @@
     </w:lvl>
   </w:abstractNum>
   <w:abstractNum w:abstractNumId="1" w15:restartNumberingAfterBreak="0">
-    <w:nsid w:val="0F6F3A68"/>
+    <w:nsid w:val="236F2545"/>
     <w:multiLevelType w:val="multilevel"/>
-    <w:tmpl w:val="8DE88E16"/>
+    <w:tmpl w:val="081C88B0"/>
     <w:lvl w:ilvl="0">
       <w:start w:val="1"/>
       <w:numFmt w:val="decimal"/>
@@ -5263,9 +6330,9 @@
     </w:lvl>
   </w:abstractNum>
   <w:abstractNum w:abstractNumId="2" w15:restartNumberingAfterBreak="0">
-    <w:nsid w:val="181A501F"/>
+    <w:nsid w:val="51E74E72"/>
     <w:multiLevelType w:val="multilevel"/>
-    <w:tmpl w:val="00CC021C"/>
+    <w:tmpl w:val="6292F7EE"/>
     <w:lvl w:ilvl="0">
       <w:start w:val="1"/>
       <w:numFmt w:val="bullet"/>
@@ -5412,9 +6479,122 @@
     </w:lvl>
   </w:abstractNum>
   <w:abstractNum w:abstractNumId="3" w15:restartNumberingAfterBreak="0">
-    <w:nsid w:val="4FDF722D"/>
+    <w:nsid w:val="5CE3480C"/>
     <w:multiLevelType w:val="multilevel"/>
-    <w:tmpl w:val="D9E6F31A"/>
+    <w:tmpl w:val="9664EBD8"/>
+    <w:lvl w:ilvl="0">
+      <w:start w:val="1"/>
+      <w:numFmt w:val="decimal"/>
+      <w:lvlText w:val="%1."/>
+      <w:lvlJc w:val="left"/>
+      <w:pPr>
+        <w:tabs>
+          <w:tab w:val="num" w:pos="720"/>
+        </w:tabs>
+        <w:ind w:left="720" w:hanging="360"/>
+      </w:pPr>
+    </w:lvl>
+    <w:lvl w:ilvl="1" w:tentative="1">
+      <w:start w:val="1"/>
+      <w:numFmt w:val="decimal"/>
+      <w:lvlText w:val="%2."/>
+      <w:lvlJc w:val="left"/>
+      <w:pPr>
+        <w:tabs>
+          <w:tab w:val="num" w:pos="1440"/>
+        </w:tabs>
+        <w:ind w:left="1440" w:hanging="360"/>
+      </w:pPr>
+    </w:lvl>
+    <w:lvl w:ilvl="2" w:tentative="1">
+      <w:start w:val="1"/>
+      <w:numFmt w:val="decimal"/>
+      <w:lvlText w:val="%3."/>
+      <w:lvlJc w:val="left"/>
+      <w:pPr>
+        <w:tabs>
+          <w:tab w:val="num" w:pos="2160"/>
+        </w:tabs>
+        <w:ind w:left="2160" w:hanging="360"/>
+      </w:pPr>
+    </w:lvl>
+    <w:lvl w:ilvl="3" w:tentative="1">
+      <w:start w:val="1"/>
+      <w:numFmt w:val="decimal"/>
+      <w:lvlText w:val="%4."/>
+      <w:lvlJc w:val="left"/>
+      <w:pPr>
+        <w:tabs>
+          <w:tab w:val="num" w:pos="2880"/>
+        </w:tabs>
+        <w:ind w:left="2880" w:hanging="360"/>
+      </w:pPr>
+    </w:lvl>
+    <w:lvl w:ilvl="4" w:tentative="1">
+      <w:start w:val="1"/>
+      <w:numFmt w:val="decimal"/>
+      <w:lvlText w:val="%5."/>
+      <w:lvlJc w:val="left"/>
+      <w:pPr>
+        <w:tabs>
+          <w:tab w:val="num" w:pos="3600"/>
+        </w:tabs>
+        <w:ind w:left="3600" w:hanging="360"/>
+      </w:pPr>
+    </w:lvl>
+    <w:lvl w:ilvl="5" w:tentative="1">
+      <w:start w:val="1"/>
+      <w:numFmt w:val="decimal"/>
+      <w:lvlText w:val="%6."/>
+      <w:lvlJc w:val="left"/>
+      <w:pPr>
+        <w:tabs>
+          <w:tab w:val="num" w:pos="4320"/>
+        </w:tabs>
+        <w:ind w:left="4320" w:hanging="360"/>
+      </w:pPr>
+    </w:lvl>
+    <w:lvl w:ilvl="6" w:tentative="1">
+      <w:start w:val="1"/>
+      <w:numFmt w:val="decimal"/>
+      <w:lvlText w:val="%7."/>
+      <w:lvlJc w:val="left"/>
+      <w:pPr>
+        <w:tabs>
+          <w:tab w:val="num" w:pos="5040"/>
+        </w:tabs>
+        <w:ind w:left="5040" w:hanging="360"/>
+      </w:pPr>
+    </w:lvl>
+    <w:lvl w:ilvl="7" w:tentative="1">
+      <w:start w:val="1"/>
+      <w:numFmt w:val="decimal"/>
+      <w:lvlText w:val="%8."/>
+      <w:lvlJc w:val="left"/>
+      <w:pPr>
+        <w:tabs>
+          <w:tab w:val="num" w:pos="5760"/>
+        </w:tabs>
+        <w:ind w:left="5760" w:hanging="360"/>
+      </w:pPr>
+    </w:lvl>
+    <w:lvl w:ilvl="8" w:tentative="1">
+      <w:start w:val="1"/>
+      <w:numFmt w:val="decimal"/>
+      <w:lvlText w:val="%9."/>
+      <w:lvlJc w:val="left"/>
+      <w:pPr>
+        <w:tabs>
+          <w:tab w:val="num" w:pos="6480"/>
+        </w:tabs>
+        <w:ind w:left="6480" w:hanging="360"/>
+      </w:pPr>
+    </w:lvl>
+  </w:abstractNum>
+  <w:abstractNum w:abstractNumId="4" w15:restartNumberingAfterBreak="0">
+    <w:nsid w:val="743A150A"/>
+    <w:multiLevelType w:val="multilevel"/>
+    <w:tmpl w:val="BADC137A"/>
     <w:lvl w:ilvl="0">
       <w:start w:val="1"/>
       <w:numFmt w:val="bullet"/>
@@ -5560,133 +6740,20 @@
       </w:rPr>
     </w:lvl>
   </w:abstractNum>
-  <w:abstractNum w:abstractNumId="4" w15:restartNumberingAfterBreak="0">
-    <w:nsid w:val="67272056"/>
-    <w:multiLevelType w:val="multilevel"/>
-    <w:tmpl w:val="9B323FB4"/>
-    <w:lvl w:ilvl="0">
-      <w:start w:val="1"/>
-      <w:numFmt w:val="decimal"/>
-      <w:lvlText w:val="%1."/>
-      <w:lvlJc w:val="left"/>
-      <w:pPr>
-        <w:tabs>
-          <w:tab w:val="num" w:pos="720"/>
-        </w:tabs>
-        <w:ind w:left="720" w:hanging="360"/>
-      </w:pPr>
-    </w:lvl>
-    <w:lvl w:ilvl="1" w:tentative="1">
-      <w:start w:val="1"/>
-      <w:numFmt w:val="decimal"/>
-      <w:lvlText w:val="%2."/>
-      <w:lvlJc w:val="left"/>
-      <w:pPr>
-        <w:tabs>
-          <w:tab w:val="num" w:pos="1440"/>
-        </w:tabs>
-        <w:ind w:left="1440" w:hanging="360"/>
-      </w:pPr>
-    </w:lvl>
-    <w:lvl w:ilvl="2" w:tentative="1">
-      <w:start w:val="1"/>
-      <w:numFmt w:val="decimal"/>
-      <w:lvlText w:val="%3."/>
-      <w:lvlJc w:val="left"/>
-      <w:pPr>
-        <w:tabs>
-          <w:tab w:val="num" w:pos="2160"/>
-        </w:tabs>
-        <w:ind w:left="2160" w:hanging="360"/>
-      </w:pPr>
-    </w:lvl>
-    <w:lvl w:ilvl="3" w:tentative="1">
-      <w:start w:val="1"/>
-      <w:numFmt w:val="decimal"/>
-      <w:lvlText w:val="%4."/>
-      <w:lvlJc w:val="left"/>
-      <w:pPr>
-        <w:tabs>
-          <w:tab w:val="num" w:pos="2880"/>
-        </w:tabs>
-        <w:ind w:left="2880" w:hanging="360"/>
-      </w:pPr>
-    </w:lvl>
-    <w:lvl w:ilvl="4" w:tentative="1">
-      <w:start w:val="1"/>
-      <w:numFmt w:val="decimal"/>
-      <w:lvlText w:val="%5."/>
-      <w:lvlJc w:val="left"/>
-      <w:pPr>
-        <w:tabs>
-          <w:tab w:val="num" w:pos="3600"/>
-        </w:tabs>
-        <w:ind w:left="3600" w:hanging="360"/>
-      </w:pPr>
-    </w:lvl>
-    <w:lvl w:ilvl="5" w:tentative="1">
-      <w:start w:val="1"/>
-      <w:numFmt w:val="decimal"/>
-      <w:lvlText w:val="%6."/>
-      <w:lvlJc w:val="left"/>
-      <w:pPr>
-        <w:tabs>
-          <w:tab w:val="num" w:pos="4320"/>
-        </w:tabs>
-        <w:ind w:left="4320" w:hanging="360"/>
-      </w:pPr>
-    </w:lvl>
-    <w:lvl w:ilvl="6" w:tentative="1">
-      <w:start w:val="1"/>
-      <w:numFmt w:val="decimal"/>
-      <w:lvlText w:val="%7."/>
-      <w:lvlJc w:val="left"/>
-      <w:pPr>
-        <w:tabs>
-          <w:tab w:val="num" w:pos="5040"/>
-        </w:tabs>
-        <w:ind w:left="5040" w:hanging="360"/>
-      </w:pPr>
-    </w:lvl>
-    <w:lvl w:ilvl="7" w:tentative="1">
-      <w:start w:val="1"/>
-      <w:numFmt w:val="decimal"/>
-      <w:lvlText w:val="%8."/>
-      <w:lvlJc w:val="left"/>
-      <w:pPr>
-        <w:tabs>
-          <w:tab w:val="num" w:pos="5760"/>
-        </w:tabs>
-        <w:ind w:left="5760" w:hanging="360"/>
-      </w:pPr>
-    </w:lvl>
-    <w:lvl w:ilvl="8" w:tentative="1">
-      <w:start w:val="1"/>
-      <w:numFmt w:val="decimal"/>
-      <w:lvlText w:val="%9."/>
-      <w:lvlJc w:val="left"/>
-      <w:pPr>
-        <w:tabs>
-          <w:tab w:val="num" w:pos="6480"/>
-        </w:tabs>
-        <w:ind w:left="6480" w:hanging="360"/>
-      </w:pPr>
-    </w:lvl>
-  </w:abstractNum>
-  <w:num w:numId="1" w16cid:durableId="841166261">
+  <w:num w:numId="1" w16cid:durableId="924607025">
     <w:abstractNumId w:val="1"/>
   </w:num>
-  <w:num w:numId="2" w16cid:durableId="525172202">
-    <w:abstractNumId w:val="4"/>
-  </w:num>
-  <w:num w:numId="3" w16cid:durableId="1982880485">
+  <w:num w:numId="2" w16cid:durableId="1129974499">
     <w:abstractNumId w:val="3"/>
   </w:num>
-  <w:num w:numId="4" w16cid:durableId="843781818">
+  <w:num w:numId="3" w16cid:durableId="2131632155">
+    <w:abstractNumId w:val="2"/>
+  </w:num>
+  <w:num w:numId="4" w16cid:durableId="1759404338">
     <w:abstractNumId w:val="0"/>
   </w:num>
-  <w:num w:numId="5" w16cid:durableId="646595635">
-    <w:abstractNumId w:val="2"/>
+  <w:num w:numId="5" w16cid:durableId="1083722195">
+    <w:abstractNumId w:val="4"/>
   </w:num>
 </w:numbering>
 </file>

</xml_diff>

<commit_message>
METODOLOGIA: rúbrica en dos franjas — Cumple (3.0 a 5.0 según calidad) y No cumple (0 a 2.9)
</commit_message>
<xml_diff>
--- a/ProyectosDeAula/docs/0_METODOLOGIA.docx
+++ b/ProyectosDeAula/docs/0_METODOLOGIA.docx
@@ -20,7 +20,7 @@
       <w:pPr>
         <w:pStyle w:val="NormalWeb"/>
         <w:shd w:val="clear" w:color="auto" w:fill="F2F6FC"/>
-        <w:divId w:val="1934430489"/>
+        <w:divId w:val="850219555"/>
         <w:rPr>
           <w:rFonts w:ascii="Calibri" w:hAnsi="Calibri" w:cs="Calibri"/>
           <w:sz w:val="22"/>
@@ -154,7 +154,7 @@
           <w:sz w:val="22"/>
           <w:szCs w:val="22"/>
         </w:rPr>
-        <w:pict w14:anchorId="30BE6475">
+        <w:pict w14:anchorId="3DADEF41">
           <v:rect id="_x0000_i1025" style="width:0;height:1.5pt" o:hralign="center" o:hrstd="t" o:hr="t" fillcolor="#a0a0a0" stroked="f"/>
         </w:pict>
       </w:r>
@@ -2679,7 +2679,7 @@
       <w:pPr>
         <w:pStyle w:val="NormalWeb"/>
         <w:shd w:val="clear" w:color="auto" w:fill="F2F6FC"/>
-        <w:divId w:val="45378908"/>
+        <w:divId w:val="163861656"/>
         <w:rPr>
           <w:rFonts w:ascii="Calibri" w:hAnsi="Calibri" w:cs="Calibri"/>
           <w:sz w:val="22"/>
@@ -3092,7 +3092,6 @@
                 <w:sz w:val="20"/>
                 <w:szCs w:val="20"/>
               </w:rPr>
-              <w:lastRenderedPageBreak/>
               <w:t>Repositorio</w:t>
             </w:r>
           </w:p>
@@ -3987,7 +3986,7 @@
       <w:pPr>
         <w:pStyle w:val="NormalWeb"/>
         <w:shd w:val="clear" w:color="auto" w:fill="F2F6FC"/>
-        <w:divId w:val="1832259719"/>
+        <w:divId w:val="1604655773"/>
         <w:rPr>
           <w:rFonts w:ascii="Calibri" w:hAnsi="Calibri" w:cs="Calibri"/>
           <w:sz w:val="22"/>
@@ -4061,7 +4060,6 @@
           <w:sz w:val="22"/>
           <w:szCs w:val="22"/>
         </w:rPr>
-        <w:lastRenderedPageBreak/>
         <w:t>Cómo cumplirla:</w:t>
       </w:r>
     </w:p>
@@ -4752,7 +4750,66 @@
           <w:sz w:val="22"/>
           <w:szCs w:val="22"/>
         </w:rPr>
-        <w:t>Aplica en cada versión; el profesor asigna el peso por criterio.</w:t>
+        <w:t xml:space="preserve">Aplica en cada versión; el profesor asigna el peso por criterio. Cada criterio se califica en una de dos franjas: </w:t>
+      </w:r>
+      <w:r>
+        <w:rPr>
+          <w:rStyle w:val="Fuerte"/>
+          <w:rFonts w:ascii="Calibri" w:hAnsi="Calibri" w:cs="Calibri"/>
+          <w:sz w:val="22"/>
+          <w:szCs w:val="22"/>
+        </w:rPr>
+        <w:t>Cumple (de 3.0 a 5.0</w:t>
+      </w:r>
+      <w:r>
+        <w:rPr>
+          <w:rFonts w:ascii="Calibri" w:hAnsi="Calibri" w:cs="Calibri"/>
+          <w:sz w:val="22"/>
+          <w:szCs w:val="22"/>
+        </w:rPr>
+        <w:t>, según la calidad de lo entregado</w:t>
+      </w:r>
+      <w:r>
+        <w:rPr>
+          <w:rStyle w:val="Fuerte"/>
+          <w:rFonts w:ascii="Calibri" w:hAnsi="Calibri" w:cs="Calibri"/>
+          <w:sz w:val="22"/>
+          <w:szCs w:val="22"/>
+        </w:rPr>
+        <w:t>)</w:t>
+      </w:r>
+      <w:r>
+        <w:rPr>
+          <w:rFonts w:ascii="Calibri" w:hAnsi="Calibri" w:cs="Calibri"/>
+          <w:sz w:val="22"/>
+          <w:szCs w:val="22"/>
+        </w:rPr>
+        <w:t xml:space="preserve"> o</w:t>
+      </w:r>
+      <w:r>
+        <w:rPr>
+          <w:rFonts w:ascii="Calibri" w:hAnsi="Calibri" w:cs="Calibri"/>
+          <w:sz w:val="22"/>
+          <w:szCs w:val="22"/>
+        </w:rPr>
+        <w:t xml:space="preserve"> </w:t>
+      </w:r>
+      <w:r>
+        <w:rPr>
+          <w:rStyle w:val="Fuerte"/>
+          <w:rFonts w:ascii="Calibri" w:hAnsi="Calibri" w:cs="Calibri"/>
+          <w:sz w:val="22"/>
+          <w:szCs w:val="22"/>
+        </w:rPr>
+        <w:t>No cumple (de 0 a 2.9)</w:t>
+      </w:r>
+      <w:r>
+        <w:rPr>
+          <w:rFonts w:ascii="Calibri" w:hAnsi="Calibri" w:cs="Calibri"/>
+          <w:sz w:val="22"/>
+          <w:szCs w:val="22"/>
+        </w:rPr>
+        <w:t>.</w:t>
       </w:r>
     </w:p>
     <w:tbl>
@@ -4812,7 +4869,6 @@
                 <w:sz w:val="20"/>
                 <w:szCs w:val="20"/>
               </w:rPr>
-              <w:lastRenderedPageBreak/>
               <w:t>Criterio</w:t>
             </w:r>
           </w:p>
@@ -4854,7 +4910,7 @@
                 <w:sz w:val="20"/>
                 <w:szCs w:val="20"/>
               </w:rPr>
-              <w:t>Excelente (5.0)</w:t>
+              <w:t>Cumple (3.0 – 5.0)</w:t>
             </w:r>
           </w:p>
         </w:tc>
@@ -4895,7 +4951,7 @@
                 <w:sz w:val="20"/>
                 <w:szCs w:val="20"/>
               </w:rPr>
-              <w:t>Insuficiente (&lt; 3.0)</w:t>
+              <w:t>No cumple (0 – 2.9)</w:t>
             </w:r>
           </w:p>
         </w:tc>
@@ -5081,7 +5137,7 @@
                 <w:sz w:val="20"/>
                 <w:szCs w:val="20"/>
               </w:rPr>
-              <w:t>Todos los endpoints de la versión funcionan con JSON y códigos correctos</w:t>
+              <w:t>Los endpoints de la versión funcionan con JSON y códigos correctos</w:t>
             </w:r>
           </w:p>
         </w:tc>
@@ -5192,7 +5248,7 @@
                 <w:sz w:val="20"/>
                 <w:szCs w:val="20"/>
               </w:rPr>
-              <w:t>Todas las interfaces consumen la API y son usables</w:t>
+              <w:t>Las interfaces consumen la API y son usables</w:t>
             </w:r>
           </w:p>
         </w:tc>
@@ -5303,7 +5359,7 @@
                 <w:sz w:val="20"/>
                 <w:szCs w:val="20"/>
               </w:rPr>
-              <w:t>Total: el front jamás toca la BD</w:t>
+              <w:t>El front jamás toca la BD</w:t>
             </w:r>
           </w:p>
         </w:tc>
@@ -5556,7 +5612,7 @@
                 <w:sz w:val="20"/>
                 <w:szCs w:val="20"/>
               </w:rPr>
-              <w:t>En todas las tablas, con inactivos filtrados</w:t>
+              <w:t>En las tablas de la versión, con inactivos filtrados</w:t>
             </w:r>
           </w:p>
         </w:tc>
@@ -5778,43 +5834,43 @@
                 <w:sz w:val="20"/>
                 <w:szCs w:val="20"/>
               </w:rPr>
-              <w:t>10+ consultas de 4+ tablas con gráficos claros</w:t>
-            </w:r>
-          </w:p>
-        </w:tc>
-        <w:tc>
-          <w:tcPr>
-            <w:tcW w:w="0" w:type="auto"/>
-            <w:tcBorders>
-              <w:top w:val="single" w:sz="6" w:space="0" w:color="8EAADB"/>
-              <w:left w:val="single" w:sz="6" w:space="0" w:color="8EAADB"/>
-              <w:bottom w:val="single" w:sz="6" w:space="0" w:color="8EAADB"/>
-              <w:right w:val="single" w:sz="6" w:space="0" w:color="8EAADB"/>
-            </w:tcBorders>
-            <w:tcMar>
-              <w:top w:w="80" w:type="dxa"/>
-              <w:left w:w="120" w:type="dxa"/>
-              <w:bottom w:w="80" w:type="dxa"/>
-              <w:right w:w="120" w:type="dxa"/>
-            </w:tcMar>
-            <w:hideMark/>
-          </w:tcPr>
-          <w:p>
-            <w:pPr>
-              <w:spacing w:before="160" w:after="160"/>
-              <w:rPr>
-                <w:rFonts w:ascii="Calibri" w:eastAsia="Times New Roman" w:hAnsi="Calibri" w:cs="Calibri"/>
-                <w:sz w:val="20"/>
-                <w:szCs w:val="20"/>
-              </w:rPr>
-            </w:pPr>
-            <w:r>
-              <w:rPr>
-                <w:rFonts w:ascii="Calibri" w:eastAsia="Times New Roman" w:hAnsi="Calibri" w:cs="Calibri"/>
-                <w:sz w:val="20"/>
-                <w:szCs w:val="20"/>
-              </w:rPr>
-              <w:t>Menos de 4 o sin dashboard</w:t>
+              <w:t>10 consultas de 4+ tablas con gráficos claros</w:t>
+            </w:r>
+          </w:p>
+        </w:tc>
+        <w:tc>
+          <w:tcPr>
+            <w:tcW w:w="0" w:type="auto"/>
+            <w:tcBorders>
+              <w:top w:val="single" w:sz="6" w:space="0" w:color="8EAADB"/>
+              <w:left w:val="single" w:sz="6" w:space="0" w:color="8EAADB"/>
+              <w:bottom w:val="single" w:sz="6" w:space="0" w:color="8EAADB"/>
+              <w:right w:val="single" w:sz="6" w:space="0" w:color="8EAADB"/>
+            </w:tcBorders>
+            <w:tcMar>
+              <w:top w:w="80" w:type="dxa"/>
+              <w:left w:w="120" w:type="dxa"/>
+              <w:bottom w:w="80" w:type="dxa"/>
+              <w:right w:w="120" w:type="dxa"/>
+            </w:tcMar>
+            <w:hideMark/>
+          </w:tcPr>
+          <w:p>
+            <w:pPr>
+              <w:spacing w:before="160" w:after="160"/>
+              <w:rPr>
+                <w:rFonts w:ascii="Calibri" w:eastAsia="Times New Roman" w:hAnsi="Calibri" w:cs="Calibri"/>
+                <w:sz w:val="20"/>
+                <w:szCs w:val="20"/>
+              </w:rPr>
+            </w:pPr>
+            <w:r>
+              <w:rPr>
+                <w:rFonts w:ascii="Calibri" w:eastAsia="Times New Roman" w:hAnsi="Calibri" w:cs="Calibri"/>
+                <w:sz w:val="20"/>
+                <w:szCs w:val="20"/>
+              </w:rPr>
+              <w:t>Menos de 10 consultas, consultas de menos de 4 tablas, o sin dashboard</w:t>
             </w:r>
           </w:p>
         </w:tc>
@@ -6053,6 +6109,24 @@
       </w:pPr>
       <w:r>
         <w:rPr>
+          <w:rFonts w:ascii="Calibri" w:hAnsi="Calibri" w:cs="Calibri"/>
+          <w:sz w:val="22"/>
+          <w:szCs w:val="22"/>
+        </w:rPr>
+        <w:t>Dentro de la franja "Cumple", la nota (3.0 a 5.0) refleja la calidad: completitud, solidez ante errores, claridad del código y de la spec, y la sustentación individual.</w:t>
+      </w:r>
+    </w:p>
+    <w:p>
+      <w:pPr>
+        <w:pStyle w:val="NormalWeb"/>
+        <w:rPr>
+          <w:rFonts w:ascii="Calibri" w:hAnsi="Calibri" w:cs="Calibri"/>
+          <w:sz w:val="22"/>
+          <w:szCs w:val="22"/>
+        </w:rPr>
+      </w:pPr>
+      <w:r>
+        <w:rPr>
           <w:rStyle w:val="Fuerte"/>
           <w:rFonts w:ascii="Calibri" w:hAnsi="Calibri" w:cs="Calibri"/>
           <w:sz w:val="22"/>
@@ -6080,15 +6154,7 @@
           <w:sz w:val="22"/>
           <w:szCs w:val="22"/>
         </w:rPr>
-        <w:t xml:space="preserve"> </w:t>
-      </w:r>
-      <w:r>
-        <w:rPr>
-          <w:rFonts w:ascii="Calibri" w:hAnsi="Calibri" w:cs="Calibri"/>
-          <w:sz w:val="22"/>
-          <w:szCs w:val="22"/>
-        </w:rPr>
-        <w:t>puesto) + evidencia del quickstart de su spec pasando. En la v4, además: URL del sitio publicado.</w:t>
+        <w:t xml:space="preserve"> puesto) + evidencia del quickstart de su spec pasando. En la v4, además: URL del sitio publicado.</w:t>
       </w:r>
     </w:p>
     <w:sectPr>
@@ -6104,9 +6170,9 @@
 <file path=word/numbering.xml><?xml version="1.0" encoding="utf-8"?>
 <w:numbering xmlns:wpc="http://schemas.microsoft.com/office/word/2010/wordprocessingCanvas" xmlns:cx="http://schemas.microsoft.com/office/drawing/2014/chartex" xmlns:cx1="http://schemas.microsoft.com/office/drawing/2015/9/8/chartex" xmlns:cx2="http://schemas.microsoft.com/office/drawing/2015/10/21/chartex" xmlns:cx3="http://schemas.microsoft.com/office/drawing/2016/5/9/chartex" xmlns:cx4="http://schemas.microsoft.com/office/drawing/2016/5/10/chartex" xmlns:cx5="http://schemas.microsoft.com/office/drawing/2016/5/11/chartex" xmlns:cx6="http://schemas.microsoft.com/office/drawing/2016/5/12/chartex" xmlns:cx7="http://schemas.microsoft.com/office/drawing/2016/5/13/chartex" xmlns:cx8="http://schemas.microsoft.com/office/drawing/2016/5/14/chartex" xmlns:mc="http://schemas.openxmlformats.org/markup-compatibility/2006" xmlns:aink="http://schemas.microsoft.com/office/drawing/2016/ink" xmlns:am3d="http://schemas.microsoft.com/office/drawing/2017/model3d" xmlns:o="urn:schemas-microsoft-com:office:office" xmlns:oel="http://schemas.microsoft.com/office/2019/extlst" xmlns:r="http://schemas.openxmlformats.org/officeDocument/2006/relationships" xmlns:m="http://schemas.openxmlformats.org/officeDocument/2006/math" xmlns:v="urn:schemas-microsoft-com:vml" xmlns:wp14="http://schemas.microsoft.com/office/word/2010/wordprocessingDrawing" xmlns:wp="http://schemas.openxmlformats.org/drawingml/2006/wordprocessingDrawing" xmlns:w10="urn:schemas-microsoft-com:office:word" xmlns:w="http://schemas.openxmlformats.org/wordprocessingml/2006/main" xmlns:w14="http://schemas.microsoft.com/office/word/2010/wordml" xmlns:w15="http://schemas.microsoft.com/office/word/2012/wordml" xmlns:w16cei="http://schemas.microsoft.com/office/word/2026/wordml/cei" xmlns:w16cex="http://schemas.microsoft.com/office/word/2018/wordml/cex" xmlns:w16cid="http://schemas.microsoft.com/office/word/2016/wordml/cid" xmlns:w16="http://schemas.microsoft.com/office/word/2018/wordml" xmlns:w16du="http://schemas.microsoft.com/office/word/2023/wordml/word16du" xmlns:w16sdtdh="http://schemas.microsoft.com/office/word/2020/wordml/sdtdatahash" xmlns:w16sdtfl="http://schemas.microsoft.com/office/word/2024/wordml/sdtformatlock" xmlns:w16se="http://schemas.microsoft.com/office/word/2015/wordml/symex" xmlns:wpg="http://schemas.microsoft.com/office/word/2010/wordprocessingGroup" xmlns:wpi="http://schemas.microsoft.com/office/word/2010/wordprocessingInk" xmlns:wne="http://schemas.microsoft.com/office/word/2006/wordml" xmlns:wps="http://schemas.microsoft.com/office/word/2010/wordprocessingShape" mc:Ignorable="w14 w15 w16se w16cid w16 w16cex w16sdtdh w16sdtfl w16du wp14">
   <w:abstractNum w:abstractNumId="0" w15:restartNumberingAfterBreak="0">
-    <w:nsid w:val="1A4F0729"/>
+    <w:nsid w:val="36790B38"/>
     <w:multiLevelType w:val="multilevel"/>
-    <w:tmpl w:val="D6E80EE6"/>
+    <w:tmpl w:val="3E4085AE"/>
     <w:lvl w:ilvl="0">
       <w:start w:val="1"/>
       <w:numFmt w:val="decimal"/>
@@ -6217,122 +6283,9 @@
     </w:lvl>
   </w:abstractNum>
   <w:abstractNum w:abstractNumId="1" w15:restartNumberingAfterBreak="0">
-    <w:nsid w:val="236F2545"/>
+    <w:nsid w:val="4FC33C72"/>
     <w:multiLevelType w:val="multilevel"/>
-    <w:tmpl w:val="081C88B0"/>
-    <w:lvl w:ilvl="0">
-      <w:start w:val="1"/>
-      <w:numFmt w:val="decimal"/>
-      <w:lvlText w:val="%1."/>
-      <w:lvlJc w:val="left"/>
-      <w:pPr>
-        <w:tabs>
-          <w:tab w:val="num" w:pos="720"/>
-        </w:tabs>
-        <w:ind w:left="720" w:hanging="360"/>
-      </w:pPr>
-    </w:lvl>
-    <w:lvl w:ilvl="1" w:tentative="1">
-      <w:start w:val="1"/>
-      <w:numFmt w:val="decimal"/>
-      <w:lvlText w:val="%2."/>
-      <w:lvlJc w:val="left"/>
-      <w:pPr>
-        <w:tabs>
-          <w:tab w:val="num" w:pos="1440"/>
-        </w:tabs>
-        <w:ind w:left="1440" w:hanging="360"/>
-      </w:pPr>
-    </w:lvl>
-    <w:lvl w:ilvl="2" w:tentative="1">
-      <w:start w:val="1"/>
-      <w:numFmt w:val="decimal"/>
-      <w:lvlText w:val="%3."/>
-      <w:lvlJc w:val="left"/>
-      <w:pPr>
-        <w:tabs>
-          <w:tab w:val="num" w:pos="2160"/>
-        </w:tabs>
-        <w:ind w:left="2160" w:hanging="360"/>
-      </w:pPr>
-    </w:lvl>
-    <w:lvl w:ilvl="3" w:tentative="1">
-      <w:start w:val="1"/>
-      <w:numFmt w:val="decimal"/>
-      <w:lvlText w:val="%4."/>
-      <w:lvlJc w:val="left"/>
-      <w:pPr>
-        <w:tabs>
-          <w:tab w:val="num" w:pos="2880"/>
-        </w:tabs>
-        <w:ind w:left="2880" w:hanging="360"/>
-      </w:pPr>
-    </w:lvl>
-    <w:lvl w:ilvl="4" w:tentative="1">
-      <w:start w:val="1"/>
-      <w:numFmt w:val="decimal"/>
-      <w:lvlText w:val="%5."/>
-      <w:lvlJc w:val="left"/>
-      <w:pPr>
-        <w:tabs>
-          <w:tab w:val="num" w:pos="3600"/>
-        </w:tabs>
-        <w:ind w:left="3600" w:hanging="360"/>
-      </w:pPr>
-    </w:lvl>
-    <w:lvl w:ilvl="5" w:tentative="1">
-      <w:start w:val="1"/>
-      <w:numFmt w:val="decimal"/>
-      <w:lvlText w:val="%6."/>
-      <w:lvlJc w:val="left"/>
-      <w:pPr>
-        <w:tabs>
-          <w:tab w:val="num" w:pos="4320"/>
-        </w:tabs>
-        <w:ind w:left="4320" w:hanging="360"/>
-      </w:pPr>
-    </w:lvl>
-    <w:lvl w:ilvl="6" w:tentative="1">
-      <w:start w:val="1"/>
-      <w:numFmt w:val="decimal"/>
-      <w:lvlText w:val="%7."/>
-      <w:lvlJc w:val="left"/>
-      <w:pPr>
-        <w:tabs>
-          <w:tab w:val="num" w:pos="5040"/>
-        </w:tabs>
-        <w:ind w:left="5040" w:hanging="360"/>
-      </w:pPr>
-    </w:lvl>
-    <w:lvl w:ilvl="7" w:tentative="1">
-      <w:start w:val="1"/>
-      <w:numFmt w:val="decimal"/>
-      <w:lvlText w:val="%8."/>
-      <w:lvlJc w:val="left"/>
-      <w:pPr>
-        <w:tabs>
-          <w:tab w:val="num" w:pos="5760"/>
-        </w:tabs>
-        <w:ind w:left="5760" w:hanging="360"/>
-      </w:pPr>
-    </w:lvl>
-    <w:lvl w:ilvl="8" w:tentative="1">
-      <w:start w:val="1"/>
-      <w:numFmt w:val="decimal"/>
-      <w:lvlText w:val="%9."/>
-      <w:lvlJc w:val="left"/>
-      <w:pPr>
-        <w:tabs>
-          <w:tab w:val="num" w:pos="6480"/>
-        </w:tabs>
-        <w:ind w:left="6480" w:hanging="360"/>
-      </w:pPr>
-    </w:lvl>
-  </w:abstractNum>
-  <w:abstractNum w:abstractNumId="2" w15:restartNumberingAfterBreak="0">
-    <w:nsid w:val="51E74E72"/>
-    <w:multiLevelType w:val="multilevel"/>
-    <w:tmpl w:val="6292F7EE"/>
+    <w:tmpl w:val="484E6660"/>
     <w:lvl w:ilvl="0">
       <w:start w:val="1"/>
       <w:numFmt w:val="bullet"/>
@@ -6478,123 +6431,10 @@
       </w:rPr>
     </w:lvl>
   </w:abstractNum>
-  <w:abstractNum w:abstractNumId="3" w15:restartNumberingAfterBreak="0">
-    <w:nsid w:val="5CE3480C"/>
+  <w:abstractNum w:abstractNumId="2" w15:restartNumberingAfterBreak="0">
+    <w:nsid w:val="542E3FE7"/>
     <w:multiLevelType w:val="multilevel"/>
-    <w:tmpl w:val="9664EBD8"/>
-    <w:lvl w:ilvl="0">
-      <w:start w:val="1"/>
-      <w:numFmt w:val="decimal"/>
-      <w:lvlText w:val="%1."/>
-      <w:lvlJc w:val="left"/>
-      <w:pPr>
-        <w:tabs>
-          <w:tab w:val="num" w:pos="720"/>
-        </w:tabs>
-        <w:ind w:left="720" w:hanging="360"/>
-      </w:pPr>
-    </w:lvl>
-    <w:lvl w:ilvl="1" w:tentative="1">
-      <w:start w:val="1"/>
-      <w:numFmt w:val="decimal"/>
-      <w:lvlText w:val="%2."/>
-      <w:lvlJc w:val="left"/>
-      <w:pPr>
-        <w:tabs>
-          <w:tab w:val="num" w:pos="1440"/>
-        </w:tabs>
-        <w:ind w:left="1440" w:hanging="360"/>
-      </w:pPr>
-    </w:lvl>
-    <w:lvl w:ilvl="2" w:tentative="1">
-      <w:start w:val="1"/>
-      <w:numFmt w:val="decimal"/>
-      <w:lvlText w:val="%3."/>
-      <w:lvlJc w:val="left"/>
-      <w:pPr>
-        <w:tabs>
-          <w:tab w:val="num" w:pos="2160"/>
-        </w:tabs>
-        <w:ind w:left="2160" w:hanging="360"/>
-      </w:pPr>
-    </w:lvl>
-    <w:lvl w:ilvl="3" w:tentative="1">
-      <w:start w:val="1"/>
-      <w:numFmt w:val="decimal"/>
-      <w:lvlText w:val="%4."/>
-      <w:lvlJc w:val="left"/>
-      <w:pPr>
-        <w:tabs>
-          <w:tab w:val="num" w:pos="2880"/>
-        </w:tabs>
-        <w:ind w:left="2880" w:hanging="360"/>
-      </w:pPr>
-    </w:lvl>
-    <w:lvl w:ilvl="4" w:tentative="1">
-      <w:start w:val="1"/>
-      <w:numFmt w:val="decimal"/>
-      <w:lvlText w:val="%5."/>
-      <w:lvlJc w:val="left"/>
-      <w:pPr>
-        <w:tabs>
-          <w:tab w:val="num" w:pos="3600"/>
-        </w:tabs>
-        <w:ind w:left="3600" w:hanging="360"/>
-      </w:pPr>
-    </w:lvl>
-    <w:lvl w:ilvl="5" w:tentative="1">
-      <w:start w:val="1"/>
-      <w:numFmt w:val="decimal"/>
-      <w:lvlText w:val="%6."/>
-      <w:lvlJc w:val="left"/>
-      <w:pPr>
-        <w:tabs>
-          <w:tab w:val="num" w:pos="4320"/>
-        </w:tabs>
-        <w:ind w:left="4320" w:hanging="360"/>
-      </w:pPr>
-    </w:lvl>
-    <w:lvl w:ilvl="6" w:tentative="1">
-      <w:start w:val="1"/>
-      <w:numFmt w:val="decimal"/>
-      <w:lvlText w:val="%7."/>
-      <w:lvlJc w:val="left"/>
-      <w:pPr>
-        <w:tabs>
-          <w:tab w:val="num" w:pos="5040"/>
-        </w:tabs>
-        <w:ind w:left="5040" w:hanging="360"/>
-      </w:pPr>
-    </w:lvl>
-    <w:lvl w:ilvl="7" w:tentative="1">
-      <w:start w:val="1"/>
-      <w:numFmt w:val="decimal"/>
-      <w:lvlText w:val="%8."/>
-      <w:lvlJc w:val="left"/>
-      <w:pPr>
-        <w:tabs>
-          <w:tab w:val="num" w:pos="5760"/>
-        </w:tabs>
-        <w:ind w:left="5760" w:hanging="360"/>
-      </w:pPr>
-    </w:lvl>
-    <w:lvl w:ilvl="8" w:tentative="1">
-      <w:start w:val="1"/>
-      <w:numFmt w:val="decimal"/>
-      <w:lvlText w:val="%9."/>
-      <w:lvlJc w:val="left"/>
-      <w:pPr>
-        <w:tabs>
-          <w:tab w:val="num" w:pos="6480"/>
-        </w:tabs>
-        <w:ind w:left="6480" w:hanging="360"/>
-      </w:pPr>
-    </w:lvl>
-  </w:abstractNum>
-  <w:abstractNum w:abstractNumId="4" w15:restartNumberingAfterBreak="0">
-    <w:nsid w:val="743A150A"/>
-    <w:multiLevelType w:val="multilevel"/>
-    <w:tmpl w:val="BADC137A"/>
+    <w:tmpl w:val="9F3AEC8E"/>
     <w:lvl w:ilvl="0">
       <w:start w:val="1"/>
       <w:numFmt w:val="bullet"/>
@@ -6740,20 +6580,246 @@
       </w:rPr>
     </w:lvl>
   </w:abstractNum>
-  <w:num w:numId="1" w16cid:durableId="924607025">
-    <w:abstractNumId w:val="1"/>
-  </w:num>
-  <w:num w:numId="2" w16cid:durableId="1129974499">
+  <w:abstractNum w:abstractNumId="3" w15:restartNumberingAfterBreak="0">
+    <w:nsid w:val="761678C6"/>
+    <w:multiLevelType w:val="multilevel"/>
+    <w:tmpl w:val="75FCD56A"/>
+    <w:lvl w:ilvl="0">
+      <w:start w:val="1"/>
+      <w:numFmt w:val="decimal"/>
+      <w:lvlText w:val="%1."/>
+      <w:lvlJc w:val="left"/>
+      <w:pPr>
+        <w:tabs>
+          <w:tab w:val="num" w:pos="720"/>
+        </w:tabs>
+        <w:ind w:left="720" w:hanging="360"/>
+      </w:pPr>
+    </w:lvl>
+    <w:lvl w:ilvl="1" w:tentative="1">
+      <w:start w:val="1"/>
+      <w:numFmt w:val="decimal"/>
+      <w:lvlText w:val="%2."/>
+      <w:lvlJc w:val="left"/>
+      <w:pPr>
+        <w:tabs>
+          <w:tab w:val="num" w:pos="1440"/>
+        </w:tabs>
+        <w:ind w:left="1440" w:hanging="360"/>
+      </w:pPr>
+    </w:lvl>
+    <w:lvl w:ilvl="2" w:tentative="1">
+      <w:start w:val="1"/>
+      <w:numFmt w:val="decimal"/>
+      <w:lvlText w:val="%3."/>
+      <w:lvlJc w:val="left"/>
+      <w:pPr>
+        <w:tabs>
+          <w:tab w:val="num" w:pos="2160"/>
+        </w:tabs>
+        <w:ind w:left="2160" w:hanging="360"/>
+      </w:pPr>
+    </w:lvl>
+    <w:lvl w:ilvl="3" w:tentative="1">
+      <w:start w:val="1"/>
+      <w:numFmt w:val="decimal"/>
+      <w:lvlText w:val="%4."/>
+      <w:lvlJc w:val="left"/>
+      <w:pPr>
+        <w:tabs>
+          <w:tab w:val="num" w:pos="2880"/>
+        </w:tabs>
+        <w:ind w:left="2880" w:hanging="360"/>
+      </w:pPr>
+    </w:lvl>
+    <w:lvl w:ilvl="4" w:tentative="1">
+      <w:start w:val="1"/>
+      <w:numFmt w:val="decimal"/>
+      <w:lvlText w:val="%5."/>
+      <w:lvlJc w:val="left"/>
+      <w:pPr>
+        <w:tabs>
+          <w:tab w:val="num" w:pos="3600"/>
+        </w:tabs>
+        <w:ind w:left="3600" w:hanging="360"/>
+      </w:pPr>
+    </w:lvl>
+    <w:lvl w:ilvl="5" w:tentative="1">
+      <w:start w:val="1"/>
+      <w:numFmt w:val="decimal"/>
+      <w:lvlText w:val="%6."/>
+      <w:lvlJc w:val="left"/>
+      <w:pPr>
+        <w:tabs>
+          <w:tab w:val="num" w:pos="4320"/>
+        </w:tabs>
+        <w:ind w:left="4320" w:hanging="360"/>
+      </w:pPr>
+    </w:lvl>
+    <w:lvl w:ilvl="6" w:tentative="1">
+      <w:start w:val="1"/>
+      <w:numFmt w:val="decimal"/>
+      <w:lvlText w:val="%7."/>
+      <w:lvlJc w:val="left"/>
+      <w:pPr>
+        <w:tabs>
+          <w:tab w:val="num" w:pos="5040"/>
+        </w:tabs>
+        <w:ind w:left="5040" w:hanging="360"/>
+      </w:pPr>
+    </w:lvl>
+    <w:lvl w:ilvl="7" w:tentative="1">
+      <w:start w:val="1"/>
+      <w:numFmt w:val="decimal"/>
+      <w:lvlText w:val="%8."/>
+      <w:lvlJc w:val="left"/>
+      <w:pPr>
+        <w:tabs>
+          <w:tab w:val="num" w:pos="5760"/>
+        </w:tabs>
+        <w:ind w:left="5760" w:hanging="360"/>
+      </w:pPr>
+    </w:lvl>
+    <w:lvl w:ilvl="8" w:tentative="1">
+      <w:start w:val="1"/>
+      <w:numFmt w:val="decimal"/>
+      <w:lvlText w:val="%9."/>
+      <w:lvlJc w:val="left"/>
+      <w:pPr>
+        <w:tabs>
+          <w:tab w:val="num" w:pos="6480"/>
+        </w:tabs>
+        <w:ind w:left="6480" w:hanging="360"/>
+      </w:pPr>
+    </w:lvl>
+  </w:abstractNum>
+  <w:abstractNum w:abstractNumId="4" w15:restartNumberingAfterBreak="0">
+    <w:nsid w:val="7C1E4FCC"/>
+    <w:multiLevelType w:val="multilevel"/>
+    <w:tmpl w:val="24FE94BA"/>
+    <w:lvl w:ilvl="0">
+      <w:start w:val="1"/>
+      <w:numFmt w:val="decimal"/>
+      <w:lvlText w:val="%1."/>
+      <w:lvlJc w:val="left"/>
+      <w:pPr>
+        <w:tabs>
+          <w:tab w:val="num" w:pos="720"/>
+        </w:tabs>
+        <w:ind w:left="720" w:hanging="360"/>
+      </w:pPr>
+    </w:lvl>
+    <w:lvl w:ilvl="1" w:tentative="1">
+      <w:start w:val="1"/>
+      <w:numFmt w:val="decimal"/>
+      <w:lvlText w:val="%2."/>
+      <w:lvlJc w:val="left"/>
+      <w:pPr>
+        <w:tabs>
+          <w:tab w:val="num" w:pos="1440"/>
+        </w:tabs>
+        <w:ind w:left="1440" w:hanging="360"/>
+      </w:pPr>
+    </w:lvl>
+    <w:lvl w:ilvl="2" w:tentative="1">
+      <w:start w:val="1"/>
+      <w:numFmt w:val="decimal"/>
+      <w:lvlText w:val="%3."/>
+      <w:lvlJc w:val="left"/>
+      <w:pPr>
+        <w:tabs>
+          <w:tab w:val="num" w:pos="2160"/>
+        </w:tabs>
+        <w:ind w:left="2160" w:hanging="360"/>
+      </w:pPr>
+    </w:lvl>
+    <w:lvl w:ilvl="3" w:tentative="1">
+      <w:start w:val="1"/>
+      <w:numFmt w:val="decimal"/>
+      <w:lvlText w:val="%4."/>
+      <w:lvlJc w:val="left"/>
+      <w:pPr>
+        <w:tabs>
+          <w:tab w:val="num" w:pos="2880"/>
+        </w:tabs>
+        <w:ind w:left="2880" w:hanging="360"/>
+      </w:pPr>
+    </w:lvl>
+    <w:lvl w:ilvl="4" w:tentative="1">
+      <w:start w:val="1"/>
+      <w:numFmt w:val="decimal"/>
+      <w:lvlText w:val="%5."/>
+      <w:lvlJc w:val="left"/>
+      <w:pPr>
+        <w:tabs>
+          <w:tab w:val="num" w:pos="3600"/>
+        </w:tabs>
+        <w:ind w:left="3600" w:hanging="360"/>
+      </w:pPr>
+    </w:lvl>
+    <w:lvl w:ilvl="5" w:tentative="1">
+      <w:start w:val="1"/>
+      <w:numFmt w:val="decimal"/>
+      <w:lvlText w:val="%6."/>
+      <w:lvlJc w:val="left"/>
+      <w:pPr>
+        <w:tabs>
+          <w:tab w:val="num" w:pos="4320"/>
+        </w:tabs>
+        <w:ind w:left="4320" w:hanging="360"/>
+      </w:pPr>
+    </w:lvl>
+    <w:lvl w:ilvl="6" w:tentative="1">
+      <w:start w:val="1"/>
+      <w:numFmt w:val="decimal"/>
+      <w:lvlText w:val="%7."/>
+      <w:lvlJc w:val="left"/>
+      <w:pPr>
+        <w:tabs>
+          <w:tab w:val="num" w:pos="5040"/>
+        </w:tabs>
+        <w:ind w:left="5040" w:hanging="360"/>
+      </w:pPr>
+    </w:lvl>
+    <w:lvl w:ilvl="7" w:tentative="1">
+      <w:start w:val="1"/>
+      <w:numFmt w:val="decimal"/>
+      <w:lvlText w:val="%8."/>
+      <w:lvlJc w:val="left"/>
+      <w:pPr>
+        <w:tabs>
+          <w:tab w:val="num" w:pos="5760"/>
+        </w:tabs>
+        <w:ind w:left="5760" w:hanging="360"/>
+      </w:pPr>
+    </w:lvl>
+    <w:lvl w:ilvl="8" w:tentative="1">
+      <w:start w:val="1"/>
+      <w:numFmt w:val="decimal"/>
+      <w:lvlText w:val="%9."/>
+      <w:lvlJc w:val="left"/>
+      <w:pPr>
+        <w:tabs>
+          <w:tab w:val="num" w:pos="6480"/>
+        </w:tabs>
+        <w:ind w:left="6480" w:hanging="360"/>
+      </w:pPr>
+    </w:lvl>
+  </w:abstractNum>
+  <w:num w:numId="1" w16cid:durableId="1655257640">
     <w:abstractNumId w:val="3"/>
   </w:num>
-  <w:num w:numId="3" w16cid:durableId="2131632155">
+  <w:num w:numId="2" w16cid:durableId="1771269312">
+    <w:abstractNumId w:val="0"/>
+  </w:num>
+  <w:num w:numId="3" w16cid:durableId="1359355270">
     <w:abstractNumId w:val="2"/>
   </w:num>
-  <w:num w:numId="4" w16cid:durableId="1759404338">
-    <w:abstractNumId w:val="0"/>
+  <w:num w:numId="4" w16cid:durableId="80413313">
+    <w:abstractNumId w:val="4"/>
   </w:num>
-  <w:num w:numId="5" w16cid:durableId="1083722195">
-    <w:abstractNumId w:val="4"/>
+  <w:num w:numId="5" w16cid:durableId="1978029866">
+    <w:abstractNumId w:val="1"/>
   </w:num>
 </w:numbering>
 </file>

</xml_diff>